<commit_message>
Nachtragsrechnung 2026-0802 v2 (Baumann): 5 Positionen, CHF 800.00
- Rechnungstabelle Deckseite auf 5 Positionen erweitert:
  Gerätebereitstellung + Fernüberwachung + Umdisposition Abbautermin
  + Auswertung Zusatzereignisse 16.08.2026 + Erweiterte Ereignisprüfung
  = Total CHF 800.00 (statt vorher CHF 635.00)
- Gesamtsumme-Projekt-Streifen: 1'850 · 800 · 2'650
- Herleitung von 7 auf 9 Sektionen erweitert:
  3 Gerätebereitstellung + Kasten „Bewusst zurückhaltend angesetzt"
  4 Position 6 mit Eigenaufwand-Tabelle (0.90 Tag / CHF 270) und CHF-300-Ansatz
  5 (NEU) Warum nicht einfach proportional gerechnet wird
  6 (NEU) Was die Verlängerung fachlich erbracht hat (5 Feststellungen)
  7 Zusammenzug 5-zeilig, 8 Einordnung mit 43.2 % / 143.2 %, 9 Zusatzleistungen
</commit_message>
<xml_diff>
--- a/dokumente/Nachtragsrechnung_2026-0802_Baumann.docx
+++ b/dokumente/Nachtragsrechnung_2026-0802_Baumann.docx
@@ -730,7 +730,7 @@
                 <w:sz w:val="20"/>
                 <w:szCs w:val="20"/>
               </w:rPr>
-              <w:t xml:space="preserve">Gerätebereitstellung 3× PQMobile5000 Class A, 5 zusätzliche Messtage, inkl. Fernüberwachung</w:t>
+              <w:t xml:space="preserve">Gerätebereitstellung 3× PQMobile5000 Class A, 5 zusätzliche Messtage</w:t>
             </w:r>
           </w:p>
         </w:tc>
@@ -854,7 +854,7 @@
                 <w:sz w:val="20"/>
                 <w:szCs w:val="20"/>
               </w:rPr>
-              <w:t xml:space="preserve">Auswertung, dauerabhängiger Anteil bei 12 statt 7 Tagen Datenbasis</w:t>
+              <w:t xml:space="preserve">Fernüberwachung, 5 zusätzliche Tageskontrollen</w:t>
             </w:r>
           </w:p>
         </w:tc>
@@ -885,7 +885,7 @@
                 <w:sz w:val="20"/>
                 <w:szCs w:val="20"/>
               </w:rPr>
-              <w:t xml:space="preserve">350 × 40 % × 5/7</w:t>
+              <w:t xml:space="preserve">0.15 Tag</w:t>
             </w:r>
           </w:p>
         </w:tc>
@@ -916,7 +916,377 @@
                 <w:sz w:val="20"/>
                 <w:szCs w:val="20"/>
               </w:rPr>
-              <w:t xml:space="preserve">100.00</w:t>
+              <w:t xml:space="preserve">45.00</w:t>
+            </w:r>
+          </w:p>
+        </w:tc>
+      </w:tr>
+      <w:tr>
+        <w:tc>
+          <w:tcPr>
+            <w:tcW w:type="dxa" w:w="700"/>
+            <w:tcMar>
+              <w:top w:type="dxa" w:w="90"/>
+              <w:left w:type="dxa" w:w="140"/>
+              <w:bottom w:type="dxa" w:w="90"/>
+              <w:right w:type="dxa" w:w="140"/>
+            </w:tcMar>
+            <w:vAlign w:val="center"/>
+          </w:tcPr>
+          <w:p>
+            <w:pPr>
+              <w:jc w:val="center"/>
+            </w:pPr>
+            <w:r>
+              <w:rPr>
+                <w:rFonts w:ascii="Calibri" w:cs="Calibri" w:eastAsia="Calibri" w:hAnsi="Calibri"/>
+                <w:b/>
+                <w:bCs/>
+                <w:i w:val="false"/>
+                <w:iCs w:val="false"/>
+                <w:color w:val="64748B"/>
+                <w:sz w:val="20"/>
+                <w:szCs w:val="20"/>
+              </w:rPr>
+              <w:t xml:space="preserve">3</w:t>
+            </w:r>
+          </w:p>
+        </w:tc>
+        <w:tc>
+          <w:tcPr>
+            <w:tcW w:type="dxa" w:w="5200"/>
+            <w:tcMar>
+              <w:top w:type="dxa" w:w="90"/>
+              <w:left w:type="dxa" w:w="140"/>
+              <w:bottom w:type="dxa" w:w="90"/>
+              <w:right w:type="dxa" w:w="140"/>
+            </w:tcMar>
+            <w:vAlign w:val="center"/>
+          </w:tcPr>
+          <w:p>
+            <w:pPr>
+              <w:jc w:val="left"/>
+            </w:pPr>
+            <w:r>
+              <w:rPr>
+                <w:rFonts w:ascii="Calibri" w:cs="Calibri" w:eastAsia="Calibri" w:hAnsi="Calibri"/>
+                <w:b w:val="false"/>
+                <w:bCs w:val="false"/>
+                <w:i w:val="false"/>
+                <w:iCs w:val="false"/>
+                <w:color w:val="0F172A"/>
+                <w:sz w:val="20"/>
+                <w:szCs w:val="20"/>
+              </w:rPr>
+              <w:t xml:space="preserve">Umdisposition und Koordination des verschobenen Abbautermins</w:t>
+            </w:r>
+          </w:p>
+        </w:tc>
+        <w:tc>
+          <w:tcPr>
+            <w:tcW w:type="dxa" w:w="1800"/>
+            <w:tcMar>
+              <w:top w:type="dxa" w:w="90"/>
+              <w:left w:type="dxa" w:w="140"/>
+              <w:bottom w:type="dxa" w:w="90"/>
+              <w:right w:type="dxa" w:w="140"/>
+            </w:tcMar>
+            <w:vAlign w:val="center"/>
+          </w:tcPr>
+          <w:p>
+            <w:pPr>
+              <w:jc w:val="right"/>
+            </w:pPr>
+            <w:r>
+              <w:rPr>
+                <w:rFonts w:ascii="Calibri" w:cs="Calibri" w:eastAsia="Calibri" w:hAnsi="Calibri"/>
+                <w:b w:val="false"/>
+                <w:bCs w:val="false"/>
+                <w:i w:val="false"/>
+                <w:iCs w:val="false"/>
+                <w:color w:val="334155"/>
+                <w:sz w:val="20"/>
+                <w:szCs w:val="20"/>
+              </w:rPr>
+              <w:t xml:space="preserve">0.25 Tag</w:t>
+            </w:r>
+          </w:p>
+        </w:tc>
+        <w:tc>
+          <w:tcPr>
+            <w:tcW w:type="dxa" w:w="1660"/>
+            <w:tcMar>
+              <w:top w:type="dxa" w:w="90"/>
+              <w:left w:type="dxa" w:w="140"/>
+              <w:bottom w:type="dxa" w:w="90"/>
+              <w:right w:type="dxa" w:w="140"/>
+            </w:tcMar>
+            <w:vAlign w:val="center"/>
+          </w:tcPr>
+          <w:p>
+            <w:pPr>
+              <w:jc w:val="right"/>
+            </w:pPr>
+            <w:r>
+              <w:rPr>
+                <w:rFonts w:ascii="Calibri" w:cs="Calibri" w:eastAsia="Calibri" w:hAnsi="Calibri"/>
+                <w:b/>
+                <w:bCs/>
+                <w:i w:val="false"/>
+                <w:iCs w:val="false"/>
+                <w:color w:val="0F172A"/>
+                <w:sz w:val="20"/>
+                <w:szCs w:val="20"/>
+              </w:rPr>
+              <w:t xml:space="preserve">75.00</w:t>
+            </w:r>
+          </w:p>
+        </w:tc>
+      </w:tr>
+      <w:tr>
+        <w:tc>
+          <w:tcPr>
+            <w:tcW w:type="dxa" w:w="700"/>
+            <w:shd w:fill="F8FAFC" w:color="auto" w:val="clear"/>
+            <w:tcMar>
+              <w:top w:type="dxa" w:w="90"/>
+              <w:left w:type="dxa" w:w="140"/>
+              <w:bottom w:type="dxa" w:w="90"/>
+              <w:right w:type="dxa" w:w="140"/>
+            </w:tcMar>
+            <w:vAlign w:val="center"/>
+          </w:tcPr>
+          <w:p>
+            <w:pPr>
+              <w:jc w:val="center"/>
+            </w:pPr>
+            <w:r>
+              <w:rPr>
+                <w:rFonts w:ascii="Calibri" w:cs="Calibri" w:eastAsia="Calibri" w:hAnsi="Calibri"/>
+                <w:b/>
+                <w:bCs/>
+                <w:i w:val="false"/>
+                <w:iCs w:val="false"/>
+                <w:color w:val="64748B"/>
+                <w:sz w:val="20"/>
+                <w:szCs w:val="20"/>
+              </w:rPr>
+              <w:t xml:space="preserve">4</w:t>
+            </w:r>
+          </w:p>
+        </w:tc>
+        <w:tc>
+          <w:tcPr>
+            <w:tcW w:type="dxa" w:w="5200"/>
+            <w:shd w:fill="F8FAFC" w:color="auto" w:val="clear"/>
+            <w:tcMar>
+              <w:top w:type="dxa" w:w="90"/>
+              <w:left w:type="dxa" w:w="140"/>
+              <w:bottom w:type="dxa" w:w="90"/>
+              <w:right w:type="dxa" w:w="140"/>
+            </w:tcMar>
+            <w:vAlign w:val="center"/>
+          </w:tcPr>
+          <w:p>
+            <w:pPr>
+              <w:jc w:val="left"/>
+            </w:pPr>
+            <w:r>
+              <w:rPr>
+                <w:rFonts w:ascii="Calibri" w:cs="Calibri" w:eastAsia="Calibri" w:hAnsi="Calibri"/>
+                <w:b w:val="false"/>
+                <w:bCs w:val="false"/>
+                <w:i w:val="false"/>
+                <w:iCs w:val="false"/>
+                <w:color w:val="0F172A"/>
+                <w:sz w:val="20"/>
+                <w:szCs w:val="20"/>
+              </w:rPr>
+              <w:t xml:space="preserve">Auswertung der beiden zusätzlichen Ereignisse vom 16.08.2026</w:t>
+            </w:r>
+          </w:p>
+        </w:tc>
+        <w:tc>
+          <w:tcPr>
+            <w:tcW w:type="dxa" w:w="1800"/>
+            <w:shd w:fill="F8FAFC" w:color="auto" w:val="clear"/>
+            <w:tcMar>
+              <w:top w:type="dxa" w:w="90"/>
+              <w:left w:type="dxa" w:w="140"/>
+              <w:bottom w:type="dxa" w:w="90"/>
+              <w:right w:type="dxa" w:w="140"/>
+            </w:tcMar>
+            <w:vAlign w:val="center"/>
+          </w:tcPr>
+          <w:p>
+            <w:pPr>
+              <w:jc w:val="right"/>
+            </w:pPr>
+            <w:r>
+              <w:rPr>
+                <w:rFonts w:ascii="Calibri" w:cs="Calibri" w:eastAsia="Calibri" w:hAnsi="Calibri"/>
+                <w:b w:val="false"/>
+                <w:bCs w:val="false"/>
+                <w:i w:val="false"/>
+                <w:iCs w:val="false"/>
+                <w:color w:val="334155"/>
+                <w:sz w:val="20"/>
+                <w:szCs w:val="20"/>
+              </w:rPr>
+              <w:t xml:space="preserve">0.25 Tag</w:t>
+            </w:r>
+          </w:p>
+        </w:tc>
+        <w:tc>
+          <w:tcPr>
+            <w:tcW w:type="dxa" w:w="1660"/>
+            <w:shd w:fill="F8FAFC" w:color="auto" w:val="clear"/>
+            <w:tcMar>
+              <w:top w:type="dxa" w:w="90"/>
+              <w:left w:type="dxa" w:w="140"/>
+              <w:bottom w:type="dxa" w:w="90"/>
+              <w:right w:type="dxa" w:w="140"/>
+            </w:tcMar>
+            <w:vAlign w:val="center"/>
+          </w:tcPr>
+          <w:p>
+            <w:pPr>
+              <w:jc w:val="right"/>
+            </w:pPr>
+            <w:r>
+              <w:rPr>
+                <w:rFonts w:ascii="Calibri" w:cs="Calibri" w:eastAsia="Calibri" w:hAnsi="Calibri"/>
+                <w:b/>
+                <w:bCs/>
+                <w:i w:val="false"/>
+                <w:iCs w:val="false"/>
+                <w:color w:val="0F172A"/>
+                <w:sz w:val="20"/>
+                <w:szCs w:val="20"/>
+              </w:rPr>
+              <w:t xml:space="preserve">75.00</w:t>
+            </w:r>
+          </w:p>
+        </w:tc>
+      </w:tr>
+      <w:tr>
+        <w:tc>
+          <w:tcPr>
+            <w:tcW w:type="dxa" w:w="700"/>
+            <w:tcMar>
+              <w:top w:type="dxa" w:w="90"/>
+              <w:left w:type="dxa" w:w="140"/>
+              <w:bottom w:type="dxa" w:w="90"/>
+              <w:right w:type="dxa" w:w="140"/>
+            </w:tcMar>
+            <w:vAlign w:val="center"/>
+          </w:tcPr>
+          <w:p>
+            <w:pPr>
+              <w:jc w:val="center"/>
+            </w:pPr>
+            <w:r>
+              <w:rPr>
+                <w:rFonts w:ascii="Calibri" w:cs="Calibri" w:eastAsia="Calibri" w:hAnsi="Calibri"/>
+                <w:b/>
+                <w:bCs/>
+                <w:i w:val="false"/>
+                <w:iCs w:val="false"/>
+                <w:color w:val="64748B"/>
+                <w:sz w:val="20"/>
+                <w:szCs w:val="20"/>
+              </w:rPr>
+              <w:t xml:space="preserve">5</w:t>
+            </w:r>
+          </w:p>
+        </w:tc>
+        <w:tc>
+          <w:tcPr>
+            <w:tcW w:type="dxa" w:w="5200"/>
+            <w:tcMar>
+              <w:top w:type="dxa" w:w="90"/>
+              <w:left w:type="dxa" w:w="140"/>
+              <w:bottom w:type="dxa" w:w="90"/>
+              <w:right w:type="dxa" w:w="140"/>
+            </w:tcMar>
+            <w:vAlign w:val="center"/>
+          </w:tcPr>
+          <w:p>
+            <w:pPr>
+              <w:jc w:val="left"/>
+            </w:pPr>
+            <w:r>
+              <w:rPr>
+                <w:rFonts w:ascii="Calibri" w:cs="Calibri" w:eastAsia="Calibri" w:hAnsi="Calibri"/>
+                <w:b w:val="false"/>
+                <w:bCs w:val="false"/>
+                <w:i w:val="false"/>
+                <w:iCs w:val="false"/>
+                <w:color w:val="0F172A"/>
+                <w:sz w:val="20"/>
+                <w:szCs w:val="20"/>
+              </w:rPr>
+              <w:t xml:space="preserve">Erweiterte Ereignis- und Zeitreihenprüfung über 12 statt 7 Tage</w:t>
+            </w:r>
+          </w:p>
+        </w:tc>
+        <w:tc>
+          <w:tcPr>
+            <w:tcW w:type="dxa" w:w="1800"/>
+            <w:tcMar>
+              <w:top w:type="dxa" w:w="90"/>
+              <w:left w:type="dxa" w:w="140"/>
+              <w:bottom w:type="dxa" w:w="90"/>
+              <w:right w:type="dxa" w:w="140"/>
+            </w:tcMar>
+            <w:vAlign w:val="center"/>
+          </w:tcPr>
+          <w:p>
+            <w:pPr>
+              <w:jc w:val="right"/>
+            </w:pPr>
+            <w:r>
+              <w:rPr>
+                <w:rFonts w:ascii="Calibri" w:cs="Calibri" w:eastAsia="Calibri" w:hAnsi="Calibri"/>
+                <w:b w:val="false"/>
+                <w:bCs w:val="false"/>
+                <w:i w:val="false"/>
+                <w:iCs w:val="false"/>
+                <w:color w:val="334155"/>
+                <w:sz w:val="20"/>
+                <w:szCs w:val="20"/>
+              </w:rPr>
+              <w:t xml:space="preserve">0.25 Tag</w:t>
+            </w:r>
+          </w:p>
+        </w:tc>
+        <w:tc>
+          <w:tcPr>
+            <w:tcW w:type="dxa" w:w="1660"/>
+            <w:tcMar>
+              <w:top w:type="dxa" w:w="90"/>
+              <w:left w:type="dxa" w:w="140"/>
+              <w:bottom w:type="dxa" w:w="90"/>
+              <w:right w:type="dxa" w:w="140"/>
+            </w:tcMar>
+            <w:vAlign w:val="center"/>
+          </w:tcPr>
+          <w:p>
+            <w:pPr>
+              <w:jc w:val="right"/>
+            </w:pPr>
+            <w:r>
+              <w:rPr>
+                <w:rFonts w:ascii="Calibri" w:cs="Calibri" w:eastAsia="Calibri" w:hAnsi="Calibri"/>
+                <w:b/>
+                <w:bCs/>
+                <w:i w:val="false"/>
+                <w:iCs w:val="false"/>
+                <w:color w:val="0F172A"/>
+                <w:sz w:val="20"/>
+                <w:szCs w:val="20"/>
+              </w:rPr>
+              <w:t xml:space="preserve">75.00</w:t>
             </w:r>
           </w:p>
         </w:tc>
@@ -1058,7 +1428,7 @@
                 <w:sz w:val="20"/>
                 <w:szCs w:val="20"/>
               </w:rPr>
-              <w:t xml:space="preserve">635.71</w:t>
+              <w:t xml:space="preserve">805.71</w:t>
             </w:r>
           </w:p>
         </w:tc>
@@ -1180,7 +1550,7 @@
                 <w:sz w:val="20"/>
                 <w:szCs w:val="20"/>
               </w:rPr>
-              <w:t xml:space="preserve">−0.71</w:t>
+              <w:t xml:space="preserve">−5.71</w:t>
             </w:r>
           </w:p>
         </w:tc>
@@ -1322,7 +1692,7 @@
                 <w:sz w:val="22"/>
                 <w:szCs w:val="22"/>
               </w:rPr>
-              <w:t xml:space="preserve">CHF  635.00</w:t>
+              <w:t xml:space="preserve">CHF  800.00</w:t>
             </w:r>
           </w:p>
         </w:tc>
@@ -1466,7 +1836,7 @@
                 <w:sz w:val="26"/>
                 <w:szCs w:val="26"/>
               </w:rPr>
-              <w:t xml:space="preserve">CHF 635.00</w:t>
+              <w:t xml:space="preserve">CHF 800.00</w:t>
             </w:r>
           </w:p>
         </w:tc>
@@ -1515,7 +1885,7 @@
                 <w:sz w:val="26"/>
                 <w:szCs w:val="26"/>
               </w:rPr>
-              <w:t xml:space="preserve">CHF 2'485.00</w:t>
+              <w:t xml:space="preserve">CHF 2'650.00</w:t>
             </w:r>
           </w:p>
         </w:tc>
@@ -3495,7 +3865,7 @@
           <w:sz w:val="24"/>
           <w:szCs w:val="24"/>
         </w:rPr>
-        <w:t xml:space="preserve">3  Position 4 · Gerätebereitstellung</w:t>
+        <w:t xml:space="preserve">3  Gerätebereitstellung, 5 zusätzliche Tage</w:t>
       </w:r>
     </w:p>
     <w:tbl>
@@ -3730,7 +4100,7 @@
                 <w:sz w:val="20"/>
                 <w:szCs w:val="20"/>
               </w:rPr>
-              <w:t xml:space="preserve">Daraus abgeleiteter Tagessatz für alle drei Geräte</w:t>
+              <w:t xml:space="preserve">Daraus abgeleiteter Tagessatz (alle 3 Geräte)</w:t>
             </w:r>
           </w:p>
         </w:tc>
@@ -4011,7 +4381,7 @@
                 <w:sz w:val="20"/>
                 <w:szCs w:val="20"/>
               </w:rPr>
-              <w:t xml:space="preserve">Mehraufwand Position 4</w:t>
+              <w:t xml:space="preserve">Mehraufwand Gerätebereitstellung</w:t>
             </w:r>
           </w:p>
         </w:tc>
@@ -4079,20 +4449,119 @@
     </w:tbl>
     <w:p>
       <w:pPr>
-        <w:spacing w:after="0" w:before="120" w:line="300" w:lineRule="auto"/>
+        <w:spacing w:before="200"/>
       </w:pPr>
       <w:r>
-        <w:rPr>
-          <w:rFonts w:ascii="Calibri" w:cs="Calibri" w:eastAsia="Calibri" w:hAnsi="Calibri"/>
-          <w:i/>
-          <w:iCs/>
-          <w:color w:val="334155"/>
-          <w:sz w:val="20"/>
-          <w:szCs w:val="20"/>
-        </w:rPr>
-        <w:t xml:space="preserve">Die Fernüberwachung ist im Ansatz der Position 4 enthalten und wird deshalb nicht separat verrechnet — sie ist über die fünf zusätzlichen Tage anteilig abgedeckt.</w:t>
+        <w:t xml:space="preserve"/>
       </w:r>
     </w:p>
+    <w:tbl>
+      <w:tblPr>
+        <w:tblW w:type="dxa" w:w="9360"/>
+        <w:tblBorders>
+          <w:top w:val="none" w:color="FFFFFF" w:sz="0"/>
+          <w:left w:val="none" w:color="FFFFFF" w:sz="0"/>
+          <w:bottom w:val="none" w:color="FFFFFF" w:sz="0"/>
+          <w:right w:val="none" w:color="FFFFFF" w:sz="0"/>
+          <w:insideH w:val="none" w:color="FFFFFF" w:sz="0"/>
+          <w:insideV w:val="none" w:color="FFFFFF" w:sz="0"/>
+        </w:tblBorders>
+      </w:tblPr>
+      <w:tblGrid>
+        <w:gridCol w:w="9360"/>
+      </w:tblGrid>
+      <w:tr>
+        <w:tc>
+          <w:tcPr>
+            <w:tcW w:type="dxa" w:w="9360"/>
+            <w:tcBorders>
+              <w:top w:val="single" w:color="E2E8F0" w:sz="4"/>
+              <w:left w:val="single" w:color="00B8D9" w:sz="24"/>
+              <w:bottom w:val="single" w:color="E2E8F0" w:sz="4"/>
+              <w:right w:val="single" w:color="E2E8F0" w:sz="4"/>
+            </w:tcBorders>
+            <w:shd w:fill="F8FAFC" w:color="auto" w:val="clear"/>
+            <w:tcMar>
+              <w:top w:type="dxa" w:w="200"/>
+              <w:left w:type="dxa" w:w="260"/>
+              <w:bottom w:type="dxa" w:w="200"/>
+              <w:right w:type="dxa" w:w="260"/>
+            </w:tcMar>
+          </w:tcPr>
+          <w:p>
+            <w:pPr>
+              <w:spacing w:after="60"/>
+            </w:pPr>
+            <w:r>
+              <w:rPr>
+                <w:rFonts w:ascii="Calibri" w:cs="Calibri" w:eastAsia="Calibri" w:hAnsi="Calibri"/>
+                <w:b/>
+                <w:bCs/>
+                <w:caps/>
+                <w:color w:val="0B2545"/>
+                <w:spacing w:val="60"/>
+                <w:sz w:val="14"/>
+                <w:szCs w:val="14"/>
+              </w:rPr>
+              <w:t xml:space="preserve">BEWUSST ZURÜCKHALTEND ANGESETZT</w:t>
+            </w:r>
+          </w:p>
+          <w:p>
+            <w:pPr>
+              <w:spacing w:after="80" w:line="300" w:lineRule="auto"/>
+            </w:pPr>
+            <w:r>
+              <w:rPr>
+                <w:rFonts w:ascii="Calibri" w:cs="Calibri" w:eastAsia="Calibri" w:hAnsi="Calibri"/>
+                <w:color w:val="0F172A"/>
+                <w:sz w:val="20"/>
+                <w:szCs w:val="20"/>
+              </w:rPr>
+              <w:t xml:space="preserve">Verwendet wird der Tagessatz aus der bestehenden Rechnung, obwohl es sich dort um einen Paketpreis für eine Sieben-Tage-Kampagne handelt.</w:t>
+            </w:r>
+          </w:p>
+          <w:p>
+            <w:pPr>
+              <w:spacing w:after="80" w:line="300" w:lineRule="auto"/>
+            </w:pPr>
+            <w:r>
+              <w:rPr>
+                <w:rFonts w:ascii="Calibri" w:cs="Calibri" w:eastAsia="Calibri" w:hAnsi="Calibri"/>
+                <w:color w:val="0F172A"/>
+                <w:sz w:val="20"/>
+                <w:szCs w:val="20"/>
+              </w:rPr>
+              <w:t xml:space="preserve">Ein Paketpreis enthält Rüstzeit, Kalibrierhaltung und Ausfallreserve, verteilt auf sieben Tage. Für zusätzliche Bindungstage ohne Deckungsbeitrag wäre ein höherer Ansatz begründbar.</w:t>
+            </w:r>
+          </w:p>
+          <w:p>
+            <w:pPr>
+              <w:spacing w:line="300" w:lineRule="auto"/>
+            </w:pPr>
+            <w:r>
+              <w:rPr>
+                <w:rFonts w:ascii="Calibri" w:cs="Calibri" w:eastAsia="Calibri" w:hAnsi="Calibri"/>
+                <w:color w:val="0F172A"/>
+                <w:sz w:val="20"/>
+                <w:szCs w:val="20"/>
+              </w:rPr>
+              <w:t xml:space="preserve">Darauf wird bewusst verzichtet, </w:t>
+            </w:r>
+            <w:r>
+              <w:rPr>
+                <w:rFonts w:ascii="Calibri" w:cs="Calibri" w:eastAsia="Calibri" w:hAnsi="Calibri"/>
+                <w:b/>
+                <w:bCs/>
+                <w:color w:val="0B2545"/>
+                <w:sz w:val="20"/>
+                <w:szCs w:val="20"/>
+              </w:rPr>
+              <w:t xml:space="preserve">damit die Nachforderung an keiner Stelle über den Ansatz der eigenen Rechnung hinausgeht.</w:t>
+            </w:r>
+          </w:p>
+        </w:tc>
+      </w:tr>
+    </w:tbl>
     <w:p>
       <w:pPr>
         <w:pStyle w:val="Heading2"/>
@@ -4522,10 +4991,16 @@
     </w:tbl>
     <w:p>
       <w:pPr>
-        <w:spacing w:before="220"/>
+        <w:spacing w:after="140" w:before="200" w:line="300" w:lineRule="auto"/>
       </w:pPr>
       <w:r>
-        <w:t xml:space="preserve"/>
+        <w:rPr>
+          <w:rFonts w:ascii="Calibri" w:cs="Calibri" w:eastAsia="Calibri" w:hAnsi="Calibri"/>
+          <w:color w:val="0F172A"/>
+          <w:sz w:val="20"/>
+          <w:szCs w:val="20"/>
+        </w:rPr>
+        <w:t xml:space="preserve">Statt einer pauschalen Fortschreibung der Position 6 wird der tatsächlich angefallene Zusatzaufwand einzeln ausgewiesen — das ist genauer und für dich nachprüfbar.</w:t>
       </w:r>
     </w:p>
     <w:tbl>
@@ -4541,9 +5016,9 @@
         </w:tblBorders>
       </w:tblPr>
       <w:tblGrid>
-        <w:gridCol w:w="4400"/>
+        <w:gridCol w:w="5000"/>
         <w:gridCol w:w="2500"/>
-        <w:gridCol w:w="2460"/>
+        <w:gridCol w:w="1860"/>
       </w:tblGrid>
       <w:tr>
         <w:trPr>
@@ -4551,7 +5026,7 @@
         </w:trPr>
         <w:tc>
           <w:tcPr>
-            <w:tcW w:type="dxa" w:w="4400"/>
+            <w:tcW w:type="dxa" w:w="5000"/>
             <w:shd w:fill="0B2545" w:color="auto" w:val="clear"/>
             <w:tcMar>
               <w:top w:type="dxa" w:w="120"/>
@@ -4575,7 +5050,7 @@
                 <w:sz w:val="18"/>
                 <w:szCs w:val="18"/>
               </w:rPr>
-              <w:t xml:space="preserve">SCHRITT</w:t>
+              <w:t xml:space="preserve">LEISTUNG</w:t>
             </w:r>
           </w:p>
         </w:tc>
@@ -4605,13 +5080,13 @@
                 <w:sz w:val="18"/>
                 <w:szCs w:val="18"/>
               </w:rPr>
-              <w:t xml:space="preserve">RECHNUNG</w:t>
-            </w:r>
-          </w:p>
-        </w:tc>
-        <w:tc>
-          <w:tcPr>
-            <w:tcW w:type="dxa" w:w="2460"/>
+              <w:t xml:space="preserve">AUFWAND</w:t>
+            </w:r>
+          </w:p>
+        </w:tc>
+        <w:tc>
+          <w:tcPr>
+            <w:tcW w:type="dxa" w:w="1860"/>
             <w:shd w:fill="0B2545" w:color="auto" w:val="clear"/>
             <w:tcMar>
               <w:top w:type="dxa" w:w="120"/>
@@ -4635,7 +5110,7 @@
                 <w:sz w:val="18"/>
                 <w:szCs w:val="18"/>
               </w:rPr>
-              <w:t xml:space="preserve">ERGEBNIS</w:t>
+              <w:t xml:space="preserve">BETRAG</w:t>
             </w:r>
           </w:p>
         </w:tc>
@@ -4643,31 +5118,31 @@
       <w:tr>
         <w:tc>
           <w:tcPr>
-            <w:tcW w:type="dxa" w:w="4400"/>
-            <w:tcMar>
-              <w:top w:type="dxa" w:w="90"/>
-              <w:left w:type="dxa" w:w="140"/>
-              <w:bottom w:type="dxa" w:w="90"/>
-              <w:right w:type="dxa" w:w="140"/>
-            </w:tcMar>
-            <w:vAlign w:val="center"/>
-          </w:tcPr>
-          <w:p>
-            <w:pPr>
-              <w:jc w:val="left"/>
-            </w:pPr>
-            <w:r>
-              <w:rPr>
-                <w:rFonts w:ascii="Calibri" w:cs="Calibri" w:eastAsia="Calibri" w:hAnsi="Calibri"/>
-                <w:b w:val="false"/>
-                <w:bCs w:val="false"/>
-                <w:i w:val="false"/>
-                <w:iCs w:val="false"/>
-                <w:color w:val="0F172A"/>
-                <w:sz w:val="20"/>
-                <w:szCs w:val="20"/>
-              </w:rPr>
-              <w:t xml:space="preserve">Ansatz aus Rechnung 2026-0801, Pos. 6</w:t>
+            <w:tcW w:type="dxa" w:w="5000"/>
+            <w:tcMar>
+              <w:top w:type="dxa" w:w="90"/>
+              <w:left w:type="dxa" w:w="140"/>
+              <w:bottom w:type="dxa" w:w="90"/>
+              <w:right w:type="dxa" w:w="140"/>
+            </w:tcMar>
+            <w:vAlign w:val="center"/>
+          </w:tcPr>
+          <w:p>
+            <w:pPr>
+              <w:jc w:val="left"/>
+            </w:pPr>
+            <w:r>
+              <w:rPr>
+                <w:rFonts w:ascii="Calibri" w:cs="Calibri" w:eastAsia="Calibri" w:hAnsi="Calibri"/>
+                <w:b w:val="false"/>
+                <w:bCs w:val="false"/>
+                <w:i w:val="false"/>
+                <w:iCs w:val="false"/>
+                <w:color w:val="0F172A"/>
+                <w:sz w:val="20"/>
+                <w:szCs w:val="20"/>
+              </w:rPr>
+              <w:t xml:space="preserve">Fernüberwachung, 5 zusätzliche Tageskontrollen</w:t>
             </w:r>
           </w:p>
         </w:tc>
@@ -4693,17 +5168,17 @@
                 <w:bCs w:val="false"/>
                 <w:i w:val="false"/>
                 <w:iCs w:val="false"/>
-                <w:color w:val="64748B"/>
-                <w:sz w:val="20"/>
-                <w:szCs w:val="20"/>
-              </w:rPr>
-              <w:t xml:space="preserve">—</w:t>
-            </w:r>
-          </w:p>
-        </w:tc>
-        <w:tc>
-          <w:tcPr>
-            <w:tcW w:type="dxa" w:w="2460"/>
+                <w:color w:val="334155"/>
+                <w:sz w:val="20"/>
+                <w:szCs w:val="20"/>
+              </w:rPr>
+              <w:t xml:space="preserve">0.15 Tag</w:t>
+            </w:r>
+          </w:p>
+        </w:tc>
+        <w:tc>
+          <w:tcPr>
+            <w:tcW w:type="dxa" w:w="1860"/>
             <w:tcMar>
               <w:top w:type="dxa" w:w="90"/>
               <w:left w:type="dxa" w:w="140"/>
@@ -4727,7 +5202,7 @@
                 <w:sz w:val="20"/>
                 <w:szCs w:val="20"/>
               </w:rPr>
-              <w:t xml:space="preserve">CHF 350.00</w:t>
+              <w:t xml:space="preserve">CHF 45.00</w:t>
             </w:r>
           </w:p>
         </w:tc>
@@ -4735,7 +5210,7 @@
       <w:tr>
         <w:tc>
           <w:tcPr>
-            <w:tcW w:type="dxa" w:w="4400"/>
+            <w:tcW w:type="dxa" w:w="5000"/>
             <w:shd w:fill="F8FAFC" w:color="auto" w:val="clear"/>
             <w:tcMar>
               <w:top w:type="dxa" w:w="90"/>
@@ -4760,7 +5235,7 @@
                 <w:sz w:val="20"/>
                 <w:szCs w:val="20"/>
               </w:rPr>
-              <w:t xml:space="preserve">Geschätzter dauerabhängiger Anteil</w:t>
+              <w:t xml:space="preserve">Umdisposition und Koordination des Abbautermins</w:t>
             </w:r>
           </w:p>
         </w:tc>
@@ -4791,13 +5266,13 @@
                 <w:sz w:val="20"/>
                 <w:szCs w:val="20"/>
               </w:rPr>
-              <w:t xml:space="preserve">40 %</w:t>
-            </w:r>
-          </w:p>
-        </w:tc>
-        <w:tc>
-          <w:tcPr>
-            <w:tcW w:type="dxa" w:w="2460"/>
+              <w:t xml:space="preserve">0.25 Tag</w:t>
+            </w:r>
+          </w:p>
+        </w:tc>
+        <w:tc>
+          <w:tcPr>
+            <w:tcW w:type="dxa" w:w="1860"/>
             <w:shd w:fill="F8FAFC" w:color="auto" w:val="clear"/>
             <w:tcMar>
               <w:top w:type="dxa" w:w="90"/>
@@ -4822,7 +5297,7 @@
                 <w:sz w:val="20"/>
                 <w:szCs w:val="20"/>
               </w:rPr>
-              <w:t xml:space="preserve">CHF 140.00</w:t>
+              <w:t xml:space="preserve">CHF 75.00</w:t>
             </w:r>
           </w:p>
         </w:tc>
@@ -4830,31 +5305,31 @@
       <w:tr>
         <w:tc>
           <w:tcPr>
-            <w:tcW w:type="dxa" w:w="4400"/>
-            <w:tcMar>
-              <w:top w:type="dxa" w:w="90"/>
-              <w:left w:type="dxa" w:w="140"/>
-              <w:bottom w:type="dxa" w:w="90"/>
-              <w:right w:type="dxa" w:w="140"/>
-            </w:tcMar>
-            <w:vAlign w:val="center"/>
-          </w:tcPr>
-          <w:p>
-            <w:pPr>
-              <w:jc w:val="left"/>
-            </w:pPr>
-            <w:r>
-              <w:rPr>
-                <w:rFonts w:ascii="Calibri" w:cs="Calibri" w:eastAsia="Calibri" w:hAnsi="Calibri"/>
-                <w:b w:val="false"/>
-                <w:bCs w:val="false"/>
-                <w:i w:val="false"/>
-                <w:iCs w:val="false"/>
-                <w:color w:val="0F172A"/>
-                <w:sz w:val="20"/>
-                <w:szCs w:val="20"/>
-              </w:rPr>
-              <w:t xml:space="preserve">Davon anteilig für 5 zusätzliche Tage</w:t>
+            <w:tcW w:type="dxa" w:w="5000"/>
+            <w:tcMar>
+              <w:top w:type="dxa" w:w="90"/>
+              <w:left w:type="dxa" w:w="140"/>
+              <w:bottom w:type="dxa" w:w="90"/>
+              <w:right w:type="dxa" w:w="140"/>
+            </w:tcMar>
+            <w:vAlign w:val="center"/>
+          </w:tcPr>
+          <w:p>
+            <w:pPr>
+              <w:jc w:val="left"/>
+            </w:pPr>
+            <w:r>
+              <w:rPr>
+                <w:rFonts w:ascii="Calibri" w:cs="Calibri" w:eastAsia="Calibri" w:hAnsi="Calibri"/>
+                <w:b w:val="false"/>
+                <w:bCs w:val="false"/>
+                <w:i w:val="false"/>
+                <w:iCs w:val="false"/>
+                <w:color w:val="0F172A"/>
+                <w:sz w:val="20"/>
+                <w:szCs w:val="20"/>
+              </w:rPr>
+              <w:t xml:space="preserve">Auswertung der beiden Zusatzereignisse vom 16.08.2026</w:t>
             </w:r>
           </w:p>
         </w:tc>
@@ -4884,13 +5359,13 @@
                 <w:sz w:val="20"/>
                 <w:szCs w:val="20"/>
               </w:rPr>
-              <w:t xml:space="preserve">× 5/7</w:t>
-            </w:r>
-          </w:p>
-        </w:tc>
-        <w:tc>
-          <w:tcPr>
-            <w:tcW w:type="dxa" w:w="2460"/>
+              <w:t xml:space="preserve">0.25 Tag</w:t>
+            </w:r>
+          </w:p>
+        </w:tc>
+        <w:tc>
+          <w:tcPr>
+            <w:tcW w:type="dxa" w:w="1860"/>
             <w:tcMar>
               <w:top w:type="dxa" w:w="90"/>
               <w:left w:type="dxa" w:w="140"/>
@@ -4914,7 +5389,7 @@
                 <w:sz w:val="20"/>
                 <w:szCs w:val="20"/>
               </w:rPr>
-              <w:t xml:space="preserve">CHF 100.00</w:t>
+              <w:t xml:space="preserve">CHF 75.00</w:t>
             </w:r>
           </w:p>
         </w:tc>
@@ -4922,7 +5397,7 @@
       <w:tr>
         <w:tc>
           <w:tcPr>
-            <w:tcW w:type="dxa" w:w="4400"/>
+            <w:tcW w:type="dxa" w:w="5000"/>
             <w:shd w:fill="F8FAFC" w:color="auto" w:val="clear"/>
             <w:tcMar>
               <w:top w:type="dxa" w:w="90"/>
@@ -4939,15 +5414,15 @@
             <w:r>
               <w:rPr>
                 <w:rFonts w:ascii="Calibri" w:cs="Calibri" w:eastAsia="Calibri" w:hAnsi="Calibri"/>
-                <w:b/>
-                <w:bCs/>
-                <w:i w:val="false"/>
-                <w:iCs w:val="false"/>
-                <w:color w:val="0B2545"/>
-                <w:sz w:val="20"/>
-                <w:szCs w:val="20"/>
-              </w:rPr>
-              <w:t xml:space="preserve">Mehraufwand Position 6</w:t>
+                <w:b w:val="false"/>
+                <w:bCs w:val="false"/>
+                <w:i w:val="false"/>
+                <w:iCs w:val="false"/>
+                <w:color w:val="0F172A"/>
+                <w:sz w:val="20"/>
+                <w:szCs w:val="20"/>
+              </w:rPr>
+              <w:t xml:space="preserve">Erweiterte Ereignis- und Zeitreihenprüfung, 12 statt 7 Tage</w:t>
             </w:r>
           </w:p>
         </w:tc>
@@ -4974,17 +5449,17 @@
                 <w:bCs w:val="false"/>
                 <w:i w:val="false"/>
                 <w:iCs w:val="false"/>
-                <w:color w:val="64748B"/>
-                <w:sz w:val="20"/>
-                <w:szCs w:val="20"/>
-              </w:rPr>
-              <w:t xml:space="preserve">—</w:t>
-            </w:r>
-          </w:p>
-        </w:tc>
-        <w:tc>
-          <w:tcPr>
-            <w:tcW w:type="dxa" w:w="2460"/>
+                <w:color w:val="334155"/>
+                <w:sz w:val="20"/>
+                <w:szCs w:val="20"/>
+              </w:rPr>
+              <w:t xml:space="preserve">0.25 Tag</w:t>
+            </w:r>
+          </w:p>
+        </w:tc>
+        <w:tc>
+          <w:tcPr>
+            <w:tcW w:type="dxa" w:w="1860"/>
             <w:shd w:fill="F8FAFC" w:color="auto" w:val="clear"/>
             <w:tcMar>
               <w:top w:type="dxa" w:w="90"/>
@@ -5005,11 +5480,11 @@
                 <w:bCs/>
                 <w:i w:val="false"/>
                 <w:iCs w:val="false"/>
-                <w:color w:val="0B2545"/>
-                <w:sz w:val="20"/>
-                <w:szCs w:val="20"/>
-              </w:rPr>
-              <w:t xml:space="preserve">CHF 100.00</w:t>
+                <w:color w:val="0F172A"/>
+                <w:sz w:val="20"/>
+                <w:szCs w:val="20"/>
+              </w:rPr>
+              <w:t xml:space="preserve">CHF 75.00</w:t>
             </w:r>
           </w:p>
         </w:tc>
@@ -5017,7 +5492,191 @@
     </w:tbl>
     <w:p>
       <w:pPr>
-        <w:spacing w:before="220"/>
+        <w:spacing w:before="40"/>
+      </w:pPr>
+      <w:r>
+        <w:t xml:space="preserve"/>
+      </w:r>
+    </w:p>
+    <w:tbl>
+      <w:tblPr>
+        <w:tblW w:type="dxa" w:w="9360"/>
+        <w:tblBorders>
+          <w:top w:val="none" w:color="FFFFFF" w:sz="0"/>
+          <w:left w:val="none" w:color="FFFFFF" w:sz="0"/>
+          <w:bottom w:val="none" w:color="FFFFFF" w:sz="0"/>
+          <w:right w:val="none" w:color="FFFFFF" w:sz="0"/>
+          <w:insideH w:val="none" w:color="FFFFFF" w:sz="0"/>
+          <w:insideV w:val="none" w:color="FFFFFF" w:sz="0"/>
+        </w:tblBorders>
+      </w:tblPr>
+      <w:tblGrid>
+        <w:gridCol w:w="5000"/>
+        <w:gridCol w:w="2500"/>
+        <w:gridCol w:w="1860"/>
+      </w:tblGrid>
+      <w:tr>
+        <w:tc>
+          <w:tcPr>
+            <w:tcW w:type="dxa" w:w="5000"/>
+            <w:tcBorders>
+              <w:top w:val="single" w:color="0B2545" w:sz="12"/>
+              <w:left w:val="single" w:color="0B2545" w:sz="4"/>
+              <w:bottom w:val="single" w:color="0B2545" w:sz="12"/>
+              <w:right w:val="single" w:color="0B2545" w:sz="4"/>
+            </w:tcBorders>
+            <w:shd w:fill="0B2545" w:color="auto" w:val="clear"/>
+            <w:tcMar>
+              <w:top w:type="dxa" w:w="120"/>
+              <w:left w:type="dxa" w:w="140"/>
+              <w:bottom w:type="dxa" w:w="120"/>
+              <w:right w:type="dxa" w:w="140"/>
+            </w:tcMar>
+            <w:vAlign w:val="center"/>
+          </w:tcPr>
+          <w:p>
+            <w:pPr>
+              <w:jc w:val="left"/>
+            </w:pPr>
+            <w:r>
+              <w:rPr>
+                <w:rFonts w:ascii="Calibri" w:cs="Calibri" w:eastAsia="Calibri" w:hAnsi="Calibri"/>
+                <w:b/>
+                <w:bCs/>
+                <w:color w:val="FFFFFF"/>
+                <w:sz w:val="22"/>
+                <w:szCs w:val="22"/>
+              </w:rPr>
+              <w:t xml:space="preserve">Summe Eigenaufwand</w:t>
+            </w:r>
+          </w:p>
+        </w:tc>
+        <w:tc>
+          <w:tcPr>
+            <w:tcW w:type="dxa" w:w="2500"/>
+            <w:tcBorders>
+              <w:top w:val="single" w:color="0B2545" w:sz="12"/>
+              <w:left w:val="single" w:color="0B2545" w:sz="4"/>
+              <w:bottom w:val="single" w:color="0B2545" w:sz="12"/>
+              <w:right w:val="single" w:color="0B2545" w:sz="4"/>
+            </w:tcBorders>
+            <w:shd w:fill="0B2545" w:color="auto" w:val="clear"/>
+            <w:tcMar>
+              <w:top w:type="dxa" w:w="120"/>
+              <w:left w:type="dxa" w:w="140"/>
+              <w:bottom w:type="dxa" w:w="120"/>
+              <w:right w:type="dxa" w:w="140"/>
+            </w:tcMar>
+            <w:vAlign w:val="center"/>
+          </w:tcPr>
+          <w:p>
+            <w:pPr>
+              <w:jc w:val="right"/>
+            </w:pPr>
+            <w:r>
+              <w:rPr>
+                <w:rFonts w:ascii="Calibri" w:cs="Calibri" w:eastAsia="Calibri" w:hAnsi="Calibri"/>
+                <w:b/>
+                <w:bCs/>
+                <w:color w:val="FFFFFF"/>
+                <w:sz w:val="22"/>
+                <w:szCs w:val="22"/>
+              </w:rPr>
+              <w:t xml:space="preserve">0.90 Tag</w:t>
+            </w:r>
+          </w:p>
+        </w:tc>
+        <w:tc>
+          <w:tcPr>
+            <w:tcW w:type="dxa" w:w="1860"/>
+            <w:tcBorders>
+              <w:top w:val="single" w:color="0B2545" w:sz="12"/>
+              <w:left w:val="single" w:color="0B2545" w:sz="4"/>
+              <w:bottom w:val="single" w:color="0B2545" w:sz="12"/>
+              <w:right w:val="single" w:color="0B2545" w:sz="4"/>
+            </w:tcBorders>
+            <w:shd w:fill="0B2545" w:color="auto" w:val="clear"/>
+            <w:tcMar>
+              <w:top w:type="dxa" w:w="120"/>
+              <w:left w:type="dxa" w:w="140"/>
+              <w:bottom w:type="dxa" w:w="120"/>
+              <w:right w:type="dxa" w:w="140"/>
+            </w:tcMar>
+            <w:vAlign w:val="center"/>
+          </w:tcPr>
+          <w:p>
+            <w:pPr>
+              <w:jc w:val="right"/>
+            </w:pPr>
+            <w:r>
+              <w:rPr>
+                <w:rFonts w:ascii="Calibri" w:cs="Calibri" w:eastAsia="Calibri" w:hAnsi="Calibri"/>
+                <w:b/>
+                <w:bCs/>
+                <w:color w:val="FFFFFF"/>
+                <w:sz w:val="22"/>
+                <w:szCs w:val="22"/>
+              </w:rPr>
+              <w:t xml:space="preserve">CHF 270.00</w:t>
+            </w:r>
+          </w:p>
+        </w:tc>
+      </w:tr>
+    </w:tbl>
+    <w:p>
+      <w:pPr>
+        <w:spacing w:after="0" w:before="160" w:line="300" w:lineRule="auto"/>
+      </w:pPr>
+      <w:r>
+        <w:rPr>
+          <w:rFonts w:ascii="Calibri" w:cs="Calibri" w:eastAsia="Calibri" w:hAnsi="Calibri"/>
+          <w:color w:val="0F172A"/>
+          <w:sz w:val="20"/>
+          <w:szCs w:val="20"/>
+        </w:rPr>
+        <w:t xml:space="preserve">Angesetzter Tagessatz: </w:t>
+      </w:r>
+      <w:r>
+        <w:rPr>
+          <w:rFonts w:ascii="Calibri" w:cs="Calibri" w:eastAsia="Calibri" w:hAnsi="Calibri"/>
+          <w:b/>
+          <w:bCs/>
+          <w:color w:val="0B2545"/>
+          <w:sz w:val="20"/>
+          <w:szCs w:val="20"/>
+        </w:rPr>
+        <w:t xml:space="preserve">CHF 300.00. </w:t>
+      </w:r>
+      <w:r>
+        <w:rPr>
+          <w:rFonts w:ascii="Calibri" w:cs="Calibri" w:eastAsia="Calibri" w:hAnsi="Calibri"/>
+          <w:color w:val="334155"/>
+          <w:sz w:val="20"/>
+          <w:szCs w:val="20"/>
+        </w:rPr>
+        <w:t xml:space="preserve">Dieser Ansatz gilt für die Verlängerung, weil der Einstiegspreis der Rechnung 2026-0801 ausdrücklich für den vereinbarten Umfang von sieben Tagen kalkuliert war. Die Verlängerung war nicht Teil dieser Vereinbarung.</w:t>
+      </w:r>
+    </w:p>
+    <w:p>
+      <w:pPr>
+        <w:pStyle w:val="Heading2"/>
+        <w:spacing w:after="100" w:before="260"/>
+      </w:pPr>
+      <w:r>
+        <w:rPr>
+          <w:rFonts w:ascii="Calibri" w:cs="Calibri" w:eastAsia="Calibri" w:hAnsi="Calibri"/>
+          <w:b/>
+          <w:bCs/>
+          <w:color w:val="0B2545"/>
+          <w:sz w:val="24"/>
+          <w:szCs w:val="24"/>
+        </w:rPr>
+        <w:t xml:space="preserve">5  Warum nicht einfach proportional gerechnet wird</w:t>
+      </w:r>
+    </w:p>
+    <w:p>
+      <w:pPr>
+        <w:spacing w:before="40"/>
       </w:pPr>
       <w:r>
         <w:t xml:space="preserve"/>
@@ -5058,7 +5717,7 @@
           </w:tcPr>
           <w:p>
             <w:pPr>
-              <w:spacing w:after="40"/>
+              <w:spacing w:after="60"/>
             </w:pPr>
             <w:r>
               <w:rPr>
@@ -5071,48 +5730,528 @@
                 <w:sz w:val="14"/>
                 <w:szCs w:val="14"/>
               </w:rPr>
-              <w:t xml:space="preserve">WARUM NICHT PROPORTIONAL</w:t>
-            </w:r>
-          </w:p>
-          <w:p>
-            <w:pPr>
-              <w:spacing w:after="60" w:line="300" w:lineRule="auto"/>
-            </w:pPr>
-            <w:r>
-              <w:rPr>
-                <w:rFonts w:ascii="Calibri" w:cs="Calibri" w:eastAsia="Calibri" w:hAnsi="Calibri"/>
-                <w:color w:val="0F172A"/>
-                <w:sz w:val="20"/>
-                <w:szCs w:val="20"/>
-              </w:rPr>
-              <w:t xml:space="preserve">Die Datenmenge wuchs um 71 %, von rund 201'600 auf rund 345'600 Drei-Sekunden-Werte je Gerät. Ein proportionaler Zuschlag von 71 % auf die gesamte Position ergäbe CHF 250.00. Das wäre nicht gerechtfertigt, weil der Perzentil-Lauf und die Berichtsstruktur unabhängig von der Messdauer sind.</w:t>
-            </w:r>
-          </w:p>
-          <w:p>
-            <w:r>
-              <w:rPr>
-                <w:rFonts w:ascii="Calibri" w:cs="Calibri" w:eastAsia="Calibri" w:hAnsi="Calibri"/>
-                <w:color w:val="0F172A"/>
+              <w:t xml:space="preserve">DIE EINFACHE RECHNUNG WÄRE TEURER GEWESEN</w:t>
+            </w:r>
+          </w:p>
+          <w:p>
+            <w:pPr>
+              <w:spacing w:after="80" w:line="300" w:lineRule="auto"/>
+            </w:pPr>
+            <w:r>
+              <w:rPr>
+                <w:rFonts w:ascii="Calibri" w:cs="Calibri" w:eastAsia="Calibri" w:hAnsi="Calibri"/>
+                <w:color w:val="0F172A"/>
+                <w:sz w:val="20"/>
+                <w:szCs w:val="20"/>
+              </w:rPr>
+              <w:t xml:space="preserve">Die Datenmenge wuchs um 71 %, von rund 201'600 auf rund 345'600 Drei-Sekunden-Werte je Gerät.</w:t>
+            </w:r>
+          </w:p>
+          <w:p>
+            <w:pPr>
+              <w:spacing w:after="80" w:line="300" w:lineRule="auto"/>
+            </w:pPr>
+            <w:r>
+              <w:rPr>
+                <w:rFonts w:ascii="Calibri" w:cs="Calibri" w:eastAsia="Calibri" w:hAnsi="Calibri"/>
+                <w:color w:val="0F172A"/>
+                <w:sz w:val="20"/>
+                <w:szCs w:val="20"/>
+              </w:rPr>
+              <w:t xml:space="preserve">Eine proportionale Fortschreibung der gesamten Rechnung ergäbe einen Nachtrag von rund </w:t>
+            </w:r>
+            <w:r>
+              <w:rPr>
+                <w:rFonts w:ascii="Calibri" w:cs="Calibri" w:eastAsia="Calibri" w:hAnsi="Calibri"/>
+                <w:b/>
+                <w:bCs/>
+                <w:color w:val="334155"/>
+                <w:sz w:val="20"/>
+                <w:szCs w:val="20"/>
+              </w:rPr>
+              <w:t xml:space="preserve">CHF 1'320.</w:t>
+            </w:r>
+          </w:p>
+          <w:p>
+            <w:pPr>
+              <w:spacing w:line="300" w:lineRule="auto"/>
+            </w:pPr>
+            <w:r>
+              <w:rPr>
+                <w:rFonts w:ascii="Calibri" w:cs="Calibri" w:eastAsia="Calibri" w:hAnsi="Calibri"/>
+                <w:color w:val="0F172A"/>
+                <w:sz w:val="20"/>
+                <w:szCs w:val="20"/>
+              </w:rPr>
+              <w:t xml:space="preserve">Verrechnet werden stattdessen nur die tatsächlich betroffenen Positionen und der real angefallene Zusatzaufwand: </w:t>
+            </w:r>
+            <w:r>
+              <w:rPr>
+                <w:rFonts w:ascii="Calibri" w:cs="Calibri" w:eastAsia="Calibri" w:hAnsi="Calibri"/>
+                <w:b/>
+                <w:bCs/>
+                <w:color w:val="0B2545"/>
+                <w:sz w:val="20"/>
+                <w:szCs w:val="20"/>
+              </w:rPr>
+              <w:t xml:space="preserve">CHF 800.00 statt CHF 1'320.</w:t>
+            </w:r>
+          </w:p>
+        </w:tc>
+      </w:tr>
+    </w:tbl>
+    <w:p>
+      <w:pPr>
+        <w:pStyle w:val="Heading2"/>
+        <w:spacing w:after="100" w:before="260"/>
+      </w:pPr>
+      <w:r>
+        <w:rPr>
+          <w:rFonts w:ascii="Calibri" w:cs="Calibri" w:eastAsia="Calibri" w:hAnsi="Calibri"/>
+          <w:b/>
+          <w:bCs/>
+          <w:color w:val="0B2545"/>
+          <w:sz w:val="24"/>
+          <w:szCs w:val="24"/>
+        </w:rPr>
+        <w:t xml:space="preserve">6  Was die Verlängerung fachlich erbracht hat</w:t>
+      </w:r>
+    </w:p>
+    <w:p>
+      <w:pPr>
+        <w:spacing w:after="140" w:before="100" w:line="300" w:lineRule="auto"/>
+      </w:pPr>
+      <w:r>
+        <w:rPr>
+          <w:rFonts w:ascii="Calibri" w:cs="Calibri" w:eastAsia="Calibri" w:hAnsi="Calibri"/>
+          <w:color w:val="0F172A"/>
+          <w:sz w:val="20"/>
+          <w:szCs w:val="20"/>
+        </w:rPr>
+        <w:t xml:space="preserve">Dieser Punkt ist für die Beurteilung wesentlich. Die Verlängerung hat nicht nur Zeit gekostet — sie hat den Beweiswert der Kampagne substanziell erhöht.</w:t>
+      </w:r>
+    </w:p>
+    <w:tbl>
+      <w:tblPr>
+        <w:tblW w:type="dxa" w:w="9360"/>
+        <w:tblBorders>
+          <w:top w:val="single" w:color="0B2545" w:sz="4"/>
+          <w:left w:val="none" w:color="FFFFFF" w:sz="0"/>
+          <w:bottom w:val="single" w:color="0B2545" w:sz="4"/>
+          <w:right w:val="none" w:color="FFFFFF" w:sz="0"/>
+          <w:insideH w:val="single" w:color="E2E8F0" w:sz="2"/>
+          <w:insideV w:val="none" w:color="FFFFFF" w:sz="0"/>
+        </w:tblBorders>
+      </w:tblPr>
+      <w:tblGrid>
+        <w:gridCol w:w="4200"/>
+        <w:gridCol w:w="5160"/>
+      </w:tblGrid>
+      <w:tr>
+        <w:trPr>
+          <w:tblHeader/>
+        </w:trPr>
+        <w:tc>
+          <w:tcPr>
+            <w:tcW w:type="dxa" w:w="4200"/>
+            <w:shd w:fill="0B2545" w:color="auto" w:val="clear"/>
+            <w:tcMar>
+              <w:top w:type="dxa" w:w="120"/>
+              <w:left w:type="dxa" w:w="140"/>
+              <w:bottom w:type="dxa" w:w="120"/>
+              <w:right w:type="dxa" w:w="140"/>
+            </w:tcMar>
+            <w:vAlign w:val="center"/>
+          </w:tcPr>
+          <w:p>
+            <w:pPr>
+              <w:jc w:val="left"/>
+            </w:pPr>
+            <w:r>
+              <w:rPr>
+                <w:rFonts w:ascii="Calibri" w:cs="Calibri" w:eastAsia="Calibri" w:hAnsi="Calibri"/>
+                <w:b/>
+                <w:bCs/>
+                <w:color w:val="FFFFFF"/>
+                <w:spacing w:val="40"/>
                 <w:sz w:val="18"/>
                 <w:szCs w:val="18"/>
               </w:rPr>
-              <w:t xml:space="preserve">Verrechnet wird deshalb nur der dauerabhängige Anteil, anteilig für fünf Tage: </w:t>
-            </w:r>
-            <w:r>
-              <w:rPr>
-                <w:rFonts w:ascii="Calibri" w:cs="Calibri" w:eastAsia="Calibri" w:hAnsi="Calibri"/>
-                <w:b/>
-                <w:bCs/>
-                <w:color w:val="0B2545"/>
+              <w:t xml:space="preserve">FESTSTELLUNG</w:t>
+            </w:r>
+          </w:p>
+        </w:tc>
+        <w:tc>
+          <w:tcPr>
+            <w:tcW w:type="dxa" w:w="5160"/>
+            <w:shd w:fill="0B2545" w:color="auto" w:val="clear"/>
+            <w:tcMar>
+              <w:top w:type="dxa" w:w="120"/>
+              <w:left w:type="dxa" w:w="140"/>
+              <w:bottom w:type="dxa" w:w="120"/>
+              <w:right w:type="dxa" w:w="140"/>
+            </w:tcMar>
+            <w:vAlign w:val="center"/>
+          </w:tcPr>
+          <w:p>
+            <w:pPr>
+              <w:jc w:val="left"/>
+            </w:pPr>
+            <w:r>
+              <w:rPr>
+                <w:rFonts w:ascii="Calibri" w:cs="Calibri" w:eastAsia="Calibri" w:hAnsi="Calibri"/>
+                <w:b/>
+                <w:bCs/>
+                <w:color w:val="FFFFFF"/>
+                <w:spacing w:val="40"/>
                 <w:sz w:val="18"/>
                 <w:szCs w:val="18"/>
               </w:rPr>
-              <w:t xml:space="preserve">CHF 100.00 statt CHF 250.00.</w:t>
+              <w:t xml:space="preserve">BEDEUTUNG</w:t>
+            </w:r>
+          </w:p>
+        </w:tc>
+      </w:tr>
+      <w:tr>
+        <w:tc>
+          <w:tcPr>
+            <w:tcW w:type="dxa" w:w="4200"/>
+            <w:tcMar>
+              <w:top w:type="dxa" w:w="90"/>
+              <w:left w:type="dxa" w:w="140"/>
+              <w:bottom w:type="dxa" w:w="90"/>
+              <w:right w:type="dxa" w:w="140"/>
+            </w:tcMar>
+            <w:vAlign w:val="center"/>
+          </w:tcPr>
+          <w:p>
+            <w:pPr>
+              <w:jc w:val="left"/>
+            </w:pPr>
+            <w:r>
+              <w:rPr>
+                <w:rFonts w:ascii="Calibri" w:cs="Calibri" w:eastAsia="Calibri" w:hAnsi="Calibri"/>
+                <w:b/>
+                <w:bCs/>
+                <w:i w:val="false"/>
+                <w:iCs w:val="false"/>
+                <w:color w:val="0F172A"/>
+                <w:sz w:val="20"/>
+                <w:szCs w:val="20"/>
+              </w:rPr>
+              <w:t xml:space="preserve">2 der 5 tragenden Ereignisse stammen aus der Verlängerung</w:t>
+            </w:r>
+          </w:p>
+        </w:tc>
+        <w:tc>
+          <w:tcPr>
+            <w:tcW w:type="dxa" w:w="5160"/>
+            <w:tcMar>
+              <w:top w:type="dxa" w:w="90"/>
+              <w:left w:type="dxa" w:w="140"/>
+              <w:bottom w:type="dxa" w:w="90"/>
+              <w:right w:type="dxa" w:w="140"/>
+            </w:tcMar>
+            <w:vAlign w:val="center"/>
+          </w:tcPr>
+          <w:p>
+            <w:pPr>
+              <w:jc w:val="left"/>
+            </w:pPr>
+            <w:r>
+              <w:rPr>
+                <w:rFonts w:ascii="Calibri" w:cs="Calibri" w:eastAsia="Calibri" w:hAnsi="Calibri"/>
+                <w:b w:val="false"/>
+                <w:bCs w:val="false"/>
+                <w:i w:val="false"/>
+                <w:iCs w:val="false"/>
+                <w:color w:val="0F172A"/>
+                <w:sz w:val="20"/>
+                <w:szCs w:val="20"/>
+              </w:rPr>
+              <w:t xml:space="preserve">Die Ereignisse vom 16.08.2026 an MP-1 und MP-3 fielen in die Zusatzzeit. Der geplante Zeitraum endete am 12.08.2026.</w:t>
+            </w:r>
+          </w:p>
+        </w:tc>
+      </w:tr>
+      <w:tr>
+        <w:tc>
+          <w:tcPr>
+            <w:tcW w:type="dxa" w:w="4200"/>
+            <w:shd w:fill="F8FAFC" w:color="auto" w:val="clear"/>
+            <w:tcMar>
+              <w:top w:type="dxa" w:w="90"/>
+              <w:left w:type="dxa" w:w="140"/>
+              <w:bottom w:type="dxa" w:w="90"/>
+              <w:right w:type="dxa" w:w="140"/>
+            </w:tcMar>
+            <w:vAlign w:val="center"/>
+          </w:tcPr>
+          <w:p>
+            <w:pPr>
+              <w:jc w:val="left"/>
+            </w:pPr>
+            <w:r>
+              <w:rPr>
+                <w:rFonts w:ascii="Calibri" w:cs="Calibri" w:eastAsia="Calibri" w:hAnsi="Calibri"/>
+                <w:b/>
+                <w:bCs/>
+                <w:i w:val="false"/>
+                <w:iCs w:val="false"/>
+                <w:color w:val="0F172A"/>
+                <w:sz w:val="20"/>
+                <w:szCs w:val="20"/>
+              </w:rPr>
+              <w:t xml:space="preserve">Bestätigung des Phasenmusters an einem zweiten Datum</w:t>
+            </w:r>
+          </w:p>
+        </w:tc>
+        <w:tc>
+          <w:tcPr>
+            <w:tcW w:type="dxa" w:w="5160"/>
+            <w:shd w:fill="F8FAFC" w:color="auto" w:val="clear"/>
+            <w:tcMar>
+              <w:top w:type="dxa" w:w="90"/>
+              <w:left w:type="dxa" w:w="140"/>
+              <w:bottom w:type="dxa" w:w="90"/>
+              <w:right w:type="dxa" w:w="140"/>
+            </w:tcMar>
+            <w:vAlign w:val="center"/>
+          </w:tcPr>
+          <w:p>
+            <w:pPr>
+              <w:jc w:val="left"/>
+            </w:pPr>
+            <w:r>
+              <w:rPr>
+                <w:rFonts w:ascii="Calibri" w:cs="Calibri" w:eastAsia="Calibri" w:hAnsi="Calibri"/>
+                <w:b w:val="false"/>
+                <w:bCs w:val="false"/>
+                <w:i w:val="false"/>
+                <w:iCs w:val="false"/>
+                <w:color w:val="0F172A"/>
+                <w:sz w:val="20"/>
+                <w:szCs w:val="20"/>
+              </w:rPr>
+              <w:t xml:space="preserve">Ohne die Verlängerung wäre die Reihenfolge L2 vor L3 vor L1 nur an einem einzigen Tag belegt gewesen.</w:t>
+            </w:r>
+          </w:p>
+        </w:tc>
+      </w:tr>
+      <w:tr>
+        <w:tc>
+          <w:tcPr>
+            <w:tcW w:type="dxa" w:w="4200"/>
+            <w:tcMar>
+              <w:top w:type="dxa" w:w="90"/>
+              <w:left w:type="dxa" w:w="140"/>
+              <w:bottom w:type="dxa" w:w="90"/>
+              <w:right w:type="dxa" w:w="140"/>
+            </w:tcMar>
+            <w:vAlign w:val="center"/>
+          </w:tcPr>
+          <w:p>
+            <w:pPr>
+              <w:jc w:val="left"/>
+            </w:pPr>
+            <w:r>
+              <w:rPr>
+                <w:rFonts w:ascii="Calibri" w:cs="Calibri" w:eastAsia="Calibri" w:hAnsi="Calibri"/>
+                <w:b/>
+                <w:bCs/>
+                <w:i w:val="false"/>
+                <w:iCs w:val="false"/>
+                <w:color w:val="0F172A"/>
+                <w:sz w:val="20"/>
+                <w:szCs w:val="20"/>
+              </w:rPr>
+              <w:t xml:space="preserve">Entlastungsbeweis für die Photovoltaikanlage</w:t>
+            </w:r>
+          </w:p>
+        </w:tc>
+        <w:tc>
+          <w:tcPr>
+            <w:tcW w:type="dxa" w:w="5160"/>
+            <w:tcMar>
+              <w:top w:type="dxa" w:w="90"/>
+              <w:left w:type="dxa" w:w="140"/>
+              <w:bottom w:type="dxa" w:w="90"/>
+              <w:right w:type="dxa" w:w="140"/>
+            </w:tcMar>
+            <w:vAlign w:val="center"/>
+          </w:tcPr>
+          <w:p>
+            <w:pPr>
+              <w:jc w:val="left"/>
+            </w:pPr>
+            <w:r>
+              <w:rPr>
+                <w:rFonts w:ascii="Calibri" w:cs="Calibri" w:eastAsia="Calibri" w:hAnsi="Calibri"/>
+                <w:b w:val="false"/>
+                <w:bCs w:val="false"/>
+                <w:i w:val="false"/>
+                <w:iCs w:val="false"/>
+                <w:color w:val="0F172A"/>
+                <w:sz w:val="20"/>
+                <w:szCs w:val="20"/>
+              </w:rPr>
+              <w:t xml:space="preserve">Der Konstantleistungs-Test, der die PV-Anlage als Verursacherin ausschliesst, stützt sich auf das Ereignis vom 16.08.2026. Ohne die Verlängerung wäre dieser Nachweis nicht möglich gewesen.</w:t>
+            </w:r>
+          </w:p>
+        </w:tc>
+      </w:tr>
+      <w:tr>
+        <w:tc>
+          <w:tcPr>
+            <w:tcW w:type="dxa" w:w="4200"/>
+            <w:shd w:fill="F8FAFC" w:color="auto" w:val="clear"/>
+            <w:tcMar>
+              <w:top w:type="dxa" w:w="90"/>
+              <w:left w:type="dxa" w:w="140"/>
+              <w:bottom w:type="dxa" w:w="90"/>
+              <w:right w:type="dxa" w:w="140"/>
+            </w:tcMar>
+            <w:vAlign w:val="center"/>
+          </w:tcPr>
+          <w:p>
+            <w:pPr>
+              <w:jc w:val="left"/>
+            </w:pPr>
+            <w:r>
+              <w:rPr>
+                <w:rFonts w:ascii="Calibri" w:cs="Calibri" w:eastAsia="Calibri" w:hAnsi="Calibri"/>
+                <w:b/>
+                <w:bCs/>
+                <w:i w:val="false"/>
+                <w:iCs w:val="false"/>
+                <w:color w:val="0F172A"/>
+                <w:sz w:val="20"/>
+                <w:szCs w:val="20"/>
+              </w:rPr>
+              <w:t xml:space="preserve">Zweite Ereignisserie als Muster</w:t>
+            </w:r>
+          </w:p>
+        </w:tc>
+        <w:tc>
+          <w:tcPr>
+            <w:tcW w:type="dxa" w:w="5160"/>
+            <w:shd w:fill="F8FAFC" w:color="auto" w:val="clear"/>
+            <w:tcMar>
+              <w:top w:type="dxa" w:w="90"/>
+              <w:left w:type="dxa" w:w="140"/>
+              <w:bottom w:type="dxa" w:w="90"/>
+              <w:right w:type="dxa" w:w="140"/>
+            </w:tcMar>
+            <w:vAlign w:val="center"/>
+          </w:tcPr>
+          <w:p>
+            <w:pPr>
+              <w:jc w:val="left"/>
+            </w:pPr>
+            <w:r>
+              <w:rPr>
+                <w:rFonts w:ascii="Calibri" w:cs="Calibri" w:eastAsia="Calibri" w:hAnsi="Calibri"/>
+                <w:b w:val="false"/>
+                <w:bCs w:val="false"/>
+                <w:i w:val="false"/>
+                <w:iCs w:val="false"/>
+                <w:color w:val="0F172A"/>
+                <w:sz w:val="20"/>
+                <w:szCs w:val="20"/>
+              </w:rPr>
+              <w:t xml:space="preserve">Erst zwei Serien an zwei verschiedenen Tagen belegen wiederkehrende Schaltvorgänge statt eines Einzelfalls.</w:t>
+            </w:r>
+          </w:p>
+        </w:tc>
+      </w:tr>
+      <w:tr>
+        <w:tc>
+          <w:tcPr>
+            <w:tcW w:type="dxa" w:w="4200"/>
+            <w:tcMar>
+              <w:top w:type="dxa" w:w="90"/>
+              <w:left w:type="dxa" w:w="140"/>
+              <w:bottom w:type="dxa" w:w="90"/>
+              <w:right w:type="dxa" w:w="140"/>
+            </w:tcMar>
+            <w:vAlign w:val="center"/>
+          </w:tcPr>
+          <w:p>
+            <w:pPr>
+              <w:jc w:val="left"/>
+            </w:pPr>
+            <w:r>
+              <w:rPr>
+                <w:rFonts w:ascii="Calibri" w:cs="Calibri" w:eastAsia="Calibri" w:hAnsi="Calibri"/>
+                <w:b/>
+                <w:bCs/>
+                <w:i w:val="false"/>
+                <w:iCs w:val="false"/>
+                <w:color w:val="0F172A"/>
+                <w:sz w:val="20"/>
+                <w:szCs w:val="20"/>
+              </w:rPr>
+              <w:t xml:space="preserve">Robustere normative Basis</w:t>
+            </w:r>
+          </w:p>
+        </w:tc>
+        <w:tc>
+          <w:tcPr>
+            <w:tcW w:type="dxa" w:w="5160"/>
+            <w:tcMar>
+              <w:top w:type="dxa" w:w="90"/>
+              <w:left w:type="dxa" w:w="140"/>
+              <w:bottom w:type="dxa" w:w="90"/>
+              <w:right w:type="dxa" w:w="140"/>
+            </w:tcMar>
+            <w:vAlign w:val="center"/>
+          </w:tcPr>
+          <w:p>
+            <w:pPr>
+              <w:jc w:val="left"/>
+            </w:pPr>
+            <w:r>
+              <w:rPr>
+                <w:rFonts w:ascii="Calibri" w:cs="Calibri" w:eastAsia="Calibri" w:hAnsi="Calibri"/>
+                <w:b w:val="false"/>
+                <w:bCs w:val="false"/>
+                <w:i w:val="false"/>
+                <w:iCs w:val="false"/>
+                <w:color w:val="0F172A"/>
+                <w:sz w:val="20"/>
+                <w:szCs w:val="20"/>
+              </w:rPr>
+              <w:t xml:space="preserve">EN-50160-Bewertung über 1.71 statt 1.0 Wochen.</w:t>
             </w:r>
           </w:p>
         </w:tc>
       </w:tr>
     </w:tbl>
+    <w:p>
+      <w:pPr>
+        <w:spacing w:after="0" w:before="160" w:line="300" w:lineRule="auto"/>
+      </w:pPr>
+      <w:r>
+        <w:rPr>
+          <w:rFonts w:ascii="Calibri" w:cs="Calibri" w:eastAsia="Calibri" w:hAnsi="Calibri"/>
+          <w:color w:val="0F172A"/>
+          <w:sz w:val="20"/>
+          <w:szCs w:val="20"/>
+        </w:rPr>
+        <w:t xml:space="preserve">Ohne diese fünf Tage stünde im Schlussbericht bei mehreren Kernaussagen ein </w:t>
+      </w:r>
+      <w:r>
+        <w:rPr>
+          <w:rFonts w:ascii="Calibri" w:cs="Calibri" w:eastAsia="Calibri" w:hAnsi="Calibri"/>
+          <w:b/>
+          <w:bCs/>
+          <w:color w:val="0B2545"/>
+          <w:sz w:val="20"/>
+          <w:szCs w:val="20"/>
+        </w:rPr>
+        <w:t xml:space="preserve">Vorbehalt statt eines Nachweises.</w:t>
+      </w:r>
+    </w:p>
     <w:p>
       <w:pPr>
         <w:spacing w:after="60" w:before="220"/>
@@ -5202,7 +6341,7 @@
           <w:sz w:val="24"/>
           <w:szCs w:val="24"/>
         </w:rPr>
-        <w:t xml:space="preserve">5  Zusammenzug</w:t>
+        <w:t xml:space="preserve">7  Zusammenzug</w:t>
       </w:r>
     </w:p>
     <w:tbl>
@@ -5344,7 +6483,7 @@
                 <w:sz w:val="20"/>
                 <w:szCs w:val="20"/>
               </w:rPr>
-              <w:t xml:space="preserve">Position 4 · Gerätebereitstellung 5 zusätzliche Tage</w:t>
+              <w:t xml:space="preserve">Gerätebereitstellung, 5 zusätzliche Tage</w:t>
             </w:r>
           </w:p>
         </w:tc>
@@ -5437,7 +6576,7 @@
                 <w:sz w:val="20"/>
                 <w:szCs w:val="20"/>
               </w:rPr>
-              <w:t xml:space="preserve">Position 6 · Auswertung, dauerabhängiger Anteil</w:t>
+              <w:t xml:space="preserve">Fernüberwachung, 5 Zusatzkontrollen</w:t>
             </w:r>
           </w:p>
         </w:tc>
@@ -5468,7 +6607,7 @@
                 <w:sz w:val="20"/>
                 <w:szCs w:val="20"/>
               </w:rPr>
-              <w:t xml:space="preserve">350 × 40 % × 5/7</w:t>
+              <w:t xml:space="preserve">0.15 Tag × 300</w:t>
             </w:r>
           </w:p>
         </w:tc>
@@ -5499,7 +6638,286 @@
                 <w:sz w:val="20"/>
                 <w:szCs w:val="20"/>
               </w:rPr>
-              <w:t xml:space="preserve">100.00</w:t>
+              <w:t xml:space="preserve">45.00</w:t>
+            </w:r>
+          </w:p>
+        </w:tc>
+      </w:tr>
+      <w:tr>
+        <w:tc>
+          <w:tcPr>
+            <w:tcW w:type="dxa" w:w="5000"/>
+            <w:tcMar>
+              <w:top w:type="dxa" w:w="90"/>
+              <w:left w:type="dxa" w:w="140"/>
+              <w:bottom w:type="dxa" w:w="90"/>
+              <w:right w:type="dxa" w:w="140"/>
+            </w:tcMar>
+            <w:vAlign w:val="center"/>
+          </w:tcPr>
+          <w:p>
+            <w:pPr>
+              <w:jc w:val="left"/>
+            </w:pPr>
+            <w:r>
+              <w:rPr>
+                <w:rFonts w:ascii="Calibri" w:cs="Calibri" w:eastAsia="Calibri" w:hAnsi="Calibri"/>
+                <w:b w:val="false"/>
+                <w:bCs w:val="false"/>
+                <w:i w:val="false"/>
+                <w:iCs w:val="false"/>
+                <w:color w:val="0F172A"/>
+                <w:sz w:val="20"/>
+                <w:szCs w:val="20"/>
+              </w:rPr>
+              <w:t xml:space="preserve">Umdisposition Abbautermin</w:t>
+            </w:r>
+          </w:p>
+        </w:tc>
+        <w:tc>
+          <w:tcPr>
+            <w:tcW w:type="dxa" w:w="2500"/>
+            <w:tcMar>
+              <w:top w:type="dxa" w:w="90"/>
+              <w:left w:type="dxa" w:w="140"/>
+              <w:bottom w:type="dxa" w:w="90"/>
+              <w:right w:type="dxa" w:w="140"/>
+            </w:tcMar>
+            <w:vAlign w:val="center"/>
+          </w:tcPr>
+          <w:p>
+            <w:pPr>
+              <w:jc w:val="right"/>
+            </w:pPr>
+            <w:r>
+              <w:rPr>
+                <w:rFonts w:ascii="Calibri" w:cs="Calibri" w:eastAsia="Calibri" w:hAnsi="Calibri"/>
+                <w:b w:val="false"/>
+                <w:bCs w:val="false"/>
+                <w:i w:val="false"/>
+                <w:iCs w:val="false"/>
+                <w:color w:val="334155"/>
+                <w:sz w:val="20"/>
+                <w:szCs w:val="20"/>
+              </w:rPr>
+              <w:t xml:space="preserve">0.25 Tag × 300</w:t>
+            </w:r>
+          </w:p>
+        </w:tc>
+        <w:tc>
+          <w:tcPr>
+            <w:tcW w:type="dxa" w:w="1860"/>
+            <w:tcMar>
+              <w:top w:type="dxa" w:w="90"/>
+              <w:left w:type="dxa" w:w="140"/>
+              <w:bottom w:type="dxa" w:w="90"/>
+              <w:right w:type="dxa" w:w="140"/>
+            </w:tcMar>
+            <w:vAlign w:val="center"/>
+          </w:tcPr>
+          <w:p>
+            <w:pPr>
+              <w:jc w:val="right"/>
+            </w:pPr>
+            <w:r>
+              <w:rPr>
+                <w:rFonts w:ascii="Calibri" w:cs="Calibri" w:eastAsia="Calibri" w:hAnsi="Calibri"/>
+                <w:b/>
+                <w:bCs/>
+                <w:i w:val="false"/>
+                <w:iCs w:val="false"/>
+                <w:color w:val="0F172A"/>
+                <w:sz w:val="20"/>
+                <w:szCs w:val="20"/>
+              </w:rPr>
+              <w:t xml:space="preserve">75.00</w:t>
+            </w:r>
+          </w:p>
+        </w:tc>
+      </w:tr>
+      <w:tr>
+        <w:tc>
+          <w:tcPr>
+            <w:tcW w:type="dxa" w:w="5000"/>
+            <w:shd w:fill="F8FAFC" w:color="auto" w:val="clear"/>
+            <w:tcMar>
+              <w:top w:type="dxa" w:w="90"/>
+              <w:left w:type="dxa" w:w="140"/>
+              <w:bottom w:type="dxa" w:w="90"/>
+              <w:right w:type="dxa" w:w="140"/>
+            </w:tcMar>
+            <w:vAlign w:val="center"/>
+          </w:tcPr>
+          <w:p>
+            <w:pPr>
+              <w:jc w:val="left"/>
+            </w:pPr>
+            <w:r>
+              <w:rPr>
+                <w:rFonts w:ascii="Calibri" w:cs="Calibri" w:eastAsia="Calibri" w:hAnsi="Calibri"/>
+                <w:b w:val="false"/>
+                <w:bCs w:val="false"/>
+                <w:i w:val="false"/>
+                <w:iCs w:val="false"/>
+                <w:color w:val="0F172A"/>
+                <w:sz w:val="20"/>
+                <w:szCs w:val="20"/>
+              </w:rPr>
+              <w:t xml:space="preserve">Auswertung Zusatzereignisse 16.08.2026</w:t>
+            </w:r>
+          </w:p>
+        </w:tc>
+        <w:tc>
+          <w:tcPr>
+            <w:tcW w:type="dxa" w:w="2500"/>
+            <w:shd w:fill="F8FAFC" w:color="auto" w:val="clear"/>
+            <w:tcMar>
+              <w:top w:type="dxa" w:w="90"/>
+              <w:left w:type="dxa" w:w="140"/>
+              <w:bottom w:type="dxa" w:w="90"/>
+              <w:right w:type="dxa" w:w="140"/>
+            </w:tcMar>
+            <w:vAlign w:val="center"/>
+          </w:tcPr>
+          <w:p>
+            <w:pPr>
+              <w:jc w:val="right"/>
+            </w:pPr>
+            <w:r>
+              <w:rPr>
+                <w:rFonts w:ascii="Calibri" w:cs="Calibri" w:eastAsia="Calibri" w:hAnsi="Calibri"/>
+                <w:b w:val="false"/>
+                <w:bCs w:val="false"/>
+                <w:i w:val="false"/>
+                <w:iCs w:val="false"/>
+                <w:color w:val="334155"/>
+                <w:sz w:val="20"/>
+                <w:szCs w:val="20"/>
+              </w:rPr>
+              <w:t xml:space="preserve">0.25 Tag × 300</w:t>
+            </w:r>
+          </w:p>
+        </w:tc>
+        <w:tc>
+          <w:tcPr>
+            <w:tcW w:type="dxa" w:w="1860"/>
+            <w:shd w:fill="F8FAFC" w:color="auto" w:val="clear"/>
+            <w:tcMar>
+              <w:top w:type="dxa" w:w="90"/>
+              <w:left w:type="dxa" w:w="140"/>
+              <w:bottom w:type="dxa" w:w="90"/>
+              <w:right w:type="dxa" w:w="140"/>
+            </w:tcMar>
+            <w:vAlign w:val="center"/>
+          </w:tcPr>
+          <w:p>
+            <w:pPr>
+              <w:jc w:val="right"/>
+            </w:pPr>
+            <w:r>
+              <w:rPr>
+                <w:rFonts w:ascii="Calibri" w:cs="Calibri" w:eastAsia="Calibri" w:hAnsi="Calibri"/>
+                <w:b/>
+                <w:bCs/>
+                <w:i w:val="false"/>
+                <w:iCs w:val="false"/>
+                <w:color w:val="0F172A"/>
+                <w:sz w:val="20"/>
+                <w:szCs w:val="20"/>
+              </w:rPr>
+              <w:t xml:space="preserve">75.00</w:t>
+            </w:r>
+          </w:p>
+        </w:tc>
+      </w:tr>
+      <w:tr>
+        <w:tc>
+          <w:tcPr>
+            <w:tcW w:type="dxa" w:w="5000"/>
+            <w:tcMar>
+              <w:top w:type="dxa" w:w="90"/>
+              <w:left w:type="dxa" w:w="140"/>
+              <w:bottom w:type="dxa" w:w="90"/>
+              <w:right w:type="dxa" w:w="140"/>
+            </w:tcMar>
+            <w:vAlign w:val="center"/>
+          </w:tcPr>
+          <w:p>
+            <w:pPr>
+              <w:jc w:val="left"/>
+            </w:pPr>
+            <w:r>
+              <w:rPr>
+                <w:rFonts w:ascii="Calibri" w:cs="Calibri" w:eastAsia="Calibri" w:hAnsi="Calibri"/>
+                <w:b w:val="false"/>
+                <w:bCs w:val="false"/>
+                <w:i w:val="false"/>
+                <w:iCs w:val="false"/>
+                <w:color w:val="0F172A"/>
+                <w:sz w:val="20"/>
+                <w:szCs w:val="20"/>
+              </w:rPr>
+              <w:t xml:space="preserve">Erweiterte Ereignisprüfung 12 statt 7 Tage</w:t>
+            </w:r>
+          </w:p>
+        </w:tc>
+        <w:tc>
+          <w:tcPr>
+            <w:tcW w:type="dxa" w:w="2500"/>
+            <w:tcMar>
+              <w:top w:type="dxa" w:w="90"/>
+              <w:left w:type="dxa" w:w="140"/>
+              <w:bottom w:type="dxa" w:w="90"/>
+              <w:right w:type="dxa" w:w="140"/>
+            </w:tcMar>
+            <w:vAlign w:val="center"/>
+          </w:tcPr>
+          <w:p>
+            <w:pPr>
+              <w:jc w:val="right"/>
+            </w:pPr>
+            <w:r>
+              <w:rPr>
+                <w:rFonts w:ascii="Calibri" w:cs="Calibri" w:eastAsia="Calibri" w:hAnsi="Calibri"/>
+                <w:b w:val="false"/>
+                <w:bCs w:val="false"/>
+                <w:i w:val="false"/>
+                <w:iCs w:val="false"/>
+                <w:color w:val="334155"/>
+                <w:sz w:val="20"/>
+                <w:szCs w:val="20"/>
+              </w:rPr>
+              <w:t xml:space="preserve">0.25 Tag × 300</w:t>
+            </w:r>
+          </w:p>
+        </w:tc>
+        <w:tc>
+          <w:tcPr>
+            <w:tcW w:type="dxa" w:w="1860"/>
+            <w:tcMar>
+              <w:top w:type="dxa" w:w="90"/>
+              <w:left w:type="dxa" w:w="140"/>
+              <w:bottom w:type="dxa" w:w="90"/>
+              <w:right w:type="dxa" w:w="140"/>
+            </w:tcMar>
+            <w:vAlign w:val="center"/>
+          </w:tcPr>
+          <w:p>
+            <w:pPr>
+              <w:jc w:val="right"/>
+            </w:pPr>
+            <w:r>
+              <w:rPr>
+                <w:rFonts w:ascii="Calibri" w:cs="Calibri" w:eastAsia="Calibri" w:hAnsi="Calibri"/>
+                <w:b/>
+                <w:bCs/>
+                <w:i w:val="false"/>
+                <w:iCs w:val="false"/>
+                <w:color w:val="0F172A"/>
+                <w:sz w:val="20"/>
+                <w:szCs w:val="20"/>
+              </w:rPr>
+              <w:t xml:space="preserve">75.00</w:t>
             </w:r>
           </w:p>
         </w:tc>
@@ -5632,7 +7050,7 @@
                 <w:sz w:val="20"/>
                 <w:szCs w:val="20"/>
               </w:rPr>
-              <w:t xml:space="preserve">635.71</w:t>
+              <w:t xml:space="preserve">805.71</w:t>
             </w:r>
           </w:p>
         </w:tc>
@@ -5724,7 +7142,7 @@
                 <w:sz w:val="20"/>
                 <w:szCs w:val="20"/>
               </w:rPr>
-              <w:t xml:space="preserve">−0.71</w:t>
+              <w:t xml:space="preserve">−5.71</w:t>
             </w:r>
           </w:p>
         </w:tc>
@@ -5831,7 +7249,7 @@
                 <w:sz w:val="22"/>
                 <w:szCs w:val="22"/>
               </w:rPr>
-              <w:t xml:space="preserve">CHF 635.00</w:t>
+              <w:t xml:space="preserve">CHF 800.00</w:t>
             </w:r>
           </w:p>
         </w:tc>
@@ -5851,7 +7269,7 @@
           <w:sz w:val="24"/>
           <w:szCs w:val="24"/>
         </w:rPr>
-        <w:t xml:space="preserve">6  Einordnung</w:t>
+        <w:t xml:space="preserve">8  Einordnung</w:t>
       </w:r>
     </w:p>
     <w:tbl>
@@ -6117,7 +7535,7 @@
                 <w:sz w:val="20"/>
                 <w:szCs w:val="20"/>
               </w:rPr>
-              <w:t xml:space="preserve">CHF 635.00</w:t>
+              <w:t xml:space="preserve">CHF 800.00</w:t>
             </w:r>
           </w:p>
         </w:tc>
@@ -6148,7 +7566,7 @@
                 <w:sz w:val="20"/>
                 <w:szCs w:val="20"/>
               </w:rPr>
-              <w:t xml:space="preserve">34.3 %</w:t>
+              <w:t xml:space="preserve">43.2 %</w:t>
             </w:r>
           </w:p>
         </w:tc>
@@ -6210,7 +7628,7 @@
                 <w:sz w:val="20"/>
                 <w:szCs w:val="20"/>
               </w:rPr>
-              <w:t xml:space="preserve">CHF 2'485.00</w:t>
+              <w:t xml:space="preserve">CHF 2'650.00</w:t>
             </w:r>
           </w:p>
         </w:tc>
@@ -6240,7 +7658,7 @@
                 <w:sz w:val="20"/>
                 <w:szCs w:val="20"/>
               </w:rPr>
-              <w:t xml:space="preserve">134.3 %</w:t>
+              <w:t xml:space="preserve">143.2 %</w:t>
             </w:r>
           </w:p>
         </w:tc>
@@ -6257,7 +7675,7 @@
           <w:sz w:val="20"/>
           <w:szCs w:val="20"/>
         </w:rPr>
-        <w:t xml:space="preserve">Bezogen auf die tatsächliche Messdauer von 12 statt 7 Tagen (also +71 %) liegt der Nachtrag mit +34.3 % deutlich unter einer proportionalen Fortschreibung. Der Grund: sechs von acht Positionen sind von der Verlängerung nicht betroffen.</w:t>
+        <w:t xml:space="preserve">Die Messdauer stieg um 71 %, die Rechnungssumme um 43.2 %. Der Nachtrag liegt damit deutlich unter einer proportionalen Fortschreibung. Der Grund: sechs von acht Positionen der Grundrechnung sind von der Verlängerung nicht betroffen und bleiben unverändert.</w:t>
       </w:r>
     </w:p>
     <w:p>
@@ -6274,7 +7692,7 @@
           <w:sz w:val="24"/>
           <w:szCs w:val="24"/>
         </w:rPr>
-        <w:t xml:space="preserve">7  Was zusätzlich geleistet und nicht verrechnet wurde</w:t>
+        <w:t xml:space="preserve">9  Was zusätzlich geleistet und nicht verrechnet wurde</w:t>
       </w:r>
     </w:p>
     <w:p>

</xml_diff>

<commit_message>
Nachtragsrechnung 2026-0802: 1'850-CHF-Referenzen entfernt + PDF
- Deckseite: BEZUG-Kachel raus (kein Verweis auf CHF 1'850), stattdessen
  neue MESSDAUER-Kachel (12 statt 7 Tage, +71 %)
- Gesamtsumme-Projekt-Streifen (1'850 · 800 · 2'650) entfernt — Fokus
  liegt allein auf dem Nachtrag CHF 800.00
- Herleitung: Sektion „8 Einordnung" (100 % / 43.2 % / 143.2 %) entfernt;
  Zusatzleistungen jetzt Sektion 8, Nummerierung angepasst
- Fusszeile zweizeilig: Brand + Seite oben, Kontakt darunter — beseitigt
  das Zusammenlaufen von E-Mail und Seitenzahl
- PDF-Version zusätzlich zur .docx im Ordner dokumente/
</commit_message>
<xml_diff>
--- a/dokumente/Nachtragsrechnung_2026-0802_Baumann.docx
+++ b/dokumente/Nachtragsrechnung_2026-0802_Baumann.docx
@@ -391,7 +391,7 @@
                 <w:sz w:val="14"/>
                 <w:szCs w:val="14"/>
               </w:rPr>
-              <w:t xml:space="preserve">BEZUG</w:t>
+              <w:t xml:space="preserve">OBJEKT</w:t>
             </w:r>
           </w:p>
           <w:p>
@@ -402,7 +402,7 @@
                 <w:sz w:val="18"/>
                 <w:szCs w:val="18"/>
               </w:rPr>
-              <w:t xml:space="preserve">Rechnung 2026-0801 vom 04.08.2026 über CHF 1'850.00</w:t>
+              <w:t xml:space="preserve">Gasthaus Kreuz, Oberdorfstrasse 16, 9524 Zuzwil SG</w:t>
             </w:r>
           </w:p>
         </w:tc>
@@ -438,7 +438,7 @@
                 <w:sz w:val="14"/>
                 <w:szCs w:val="14"/>
               </w:rPr>
-              <w:t xml:space="preserve">OBJEKT</w:t>
+              <w:t xml:space="preserve">LEISTUNGSZEITRAUM</w:t>
             </w:r>
           </w:p>
           <w:p>
@@ -449,7 +449,7 @@
                 <w:sz w:val="18"/>
                 <w:szCs w:val="18"/>
               </w:rPr>
-              <w:t xml:space="preserve">Gasthaus Kreuz, Oberdorfstrasse 16, 9524 Zuzwil SG</w:t>
+              <w:t xml:space="preserve">05.08.2026 bis 17.08.2026 (verlängerte Messdauer)</w:t>
             </w:r>
           </w:p>
         </w:tc>
@@ -485,7 +485,7 @@
                 <w:sz w:val="14"/>
                 <w:szCs w:val="14"/>
               </w:rPr>
-              <w:t xml:space="preserve">LEISTUNGSZEITRAUM</w:t>
+              <w:t xml:space="preserve">MESSDAUER</w:t>
             </w:r>
           </w:p>
           <w:p>
@@ -496,7 +496,7 @@
                 <w:sz w:val="18"/>
                 <w:szCs w:val="18"/>
               </w:rPr>
-              <w:t xml:space="preserve">05.08.2026 bis 17.08.2026 (verlängerte Messdauer)</w:t>
+              <w:t xml:space="preserve">12 statt 7 Tage (+5 Tage / +71 %)</w:t>
             </w:r>
           </w:p>
         </w:tc>
@@ -1693,199 +1693,6 @@
                 <w:szCs w:val="22"/>
               </w:rPr>
               <w:t xml:space="preserve">CHF  800.00</w:t>
-            </w:r>
-          </w:p>
-        </w:tc>
-      </w:tr>
-    </w:tbl>
-    <w:p>
-      <w:pPr>
-        <w:spacing w:before="220"/>
-      </w:pPr>
-      <w:r>
-        <w:rPr>
-          <w:rFonts w:ascii="Calibri" w:cs="Calibri" w:eastAsia="Calibri" w:hAnsi="Calibri"/>
-          <w:b/>
-          <w:bCs/>
-          <w:caps/>
-          <w:color w:val="00B8D9"/>
-          <w:spacing w:val="80"/>
-          <w:sz w:val="14"/>
-          <w:szCs w:val="14"/>
-        </w:rPr>
-        <w:t xml:space="preserve">GESAMTSUMME PROJEKT</w:t>
-      </w:r>
-    </w:p>
-    <w:p>
-      <w:pPr>
-        <w:spacing w:after="100"/>
-      </w:pPr>
-      <w:r>
-        <w:t xml:space="preserve"/>
-      </w:r>
-    </w:p>
-    <w:tbl>
-      <w:tblPr>
-        <w:tblW w:type="dxa" w:w="9360"/>
-        <w:tblBorders>
-          <w:top w:val="none" w:color="FFFFFF" w:sz="0"/>
-          <w:left w:val="none" w:color="FFFFFF" w:sz="0"/>
-          <w:bottom w:val="none" w:color="FFFFFF" w:sz="0"/>
-          <w:right w:val="none" w:color="FFFFFF" w:sz="0"/>
-          <w:insideH w:val="none" w:color="FFFFFF" w:sz="0"/>
-          <w:insideV w:val="none" w:color="FFFFFF" w:sz="0"/>
-        </w:tblBorders>
-      </w:tblPr>
-      <w:tblGrid>
-        <w:gridCol w:w="3120"/>
-        <w:gridCol w:w="3120"/>
-        <w:gridCol w:w="3120"/>
-      </w:tblGrid>
-      <w:tr>
-        <w:tc>
-          <w:tcPr>
-            <w:tcW w:type="dxa" w:w="3120"/>
-            <w:tcBorders>
-              <w:top w:val="single" w:color="E2E8F0" w:sz="4"/>
-              <w:left w:val="single" w:color="E2E8F0" w:sz="4"/>
-              <w:bottom w:val="single" w:color="E2E8F0" w:sz="4"/>
-              <w:right w:val="single" w:color="E2E8F0" w:sz="4"/>
-            </w:tcBorders>
-            <w:shd w:fill="F8FAFC" w:color="auto" w:val="clear"/>
-            <w:tcMar>
-              <w:top w:type="dxa" w:w="200"/>
-              <w:left w:type="dxa" w:w="220"/>
-              <w:bottom w:type="dxa" w:w="200"/>
-              <w:right w:type="dxa" w:w="220"/>
-            </w:tcMar>
-          </w:tcPr>
-          <w:p>
-            <w:pPr>
-              <w:spacing w:after="40"/>
-            </w:pPr>
-            <w:r>
-              <w:rPr>
-                <w:rFonts w:ascii="Calibri" w:cs="Calibri" w:eastAsia="Calibri" w:hAnsi="Calibri"/>
-                <w:b/>
-                <w:bCs/>
-                <w:caps/>
-                <w:color w:val="64748B"/>
-                <w:spacing w:val="60"/>
-                <w:sz w:val="14"/>
-                <w:szCs w:val="14"/>
-              </w:rPr>
-              <w:t xml:space="preserve">Rechnung 2026-0801</w:t>
-            </w:r>
-          </w:p>
-          <w:p>
-            <w:r>
-              <w:rPr>
-                <w:rFonts w:ascii="Calibri" w:cs="Calibri" w:eastAsia="Calibri" w:hAnsi="Calibri"/>
-                <w:b/>
-                <w:bCs/>
-                <w:color w:val="0B2545"/>
-                <w:sz w:val="26"/>
-                <w:szCs w:val="26"/>
-              </w:rPr>
-              <w:t xml:space="preserve">CHF 1'850.00</w:t>
-            </w:r>
-          </w:p>
-        </w:tc>
-        <w:tc>
-          <w:tcPr>
-            <w:tcW w:type="dxa" w:w="3120"/>
-            <w:tcBorders>
-              <w:top w:val="single" w:color="E2E8F0" w:sz="4"/>
-              <w:left w:val="single" w:color="E2E8F0" w:sz="4"/>
-              <w:bottom w:val="single" w:color="E2E8F0" w:sz="4"/>
-              <w:right w:val="single" w:color="E2E8F0" w:sz="4"/>
-            </w:tcBorders>
-            <w:shd w:fill="F8FAFC" w:color="auto" w:val="clear"/>
-            <w:tcMar>
-              <w:top w:type="dxa" w:w="200"/>
-              <w:left w:type="dxa" w:w="220"/>
-              <w:bottom w:type="dxa" w:w="200"/>
-              <w:right w:type="dxa" w:w="220"/>
-            </w:tcMar>
-          </w:tcPr>
-          <w:p>
-            <w:pPr>
-              <w:spacing w:after="40"/>
-            </w:pPr>
-            <w:r>
-              <w:rPr>
-                <w:rFonts w:ascii="Calibri" w:cs="Calibri" w:eastAsia="Calibri" w:hAnsi="Calibri"/>
-                <w:b/>
-                <w:bCs/>
-                <w:caps/>
-                <w:color w:val="64748B"/>
-                <w:spacing w:val="60"/>
-                <w:sz w:val="14"/>
-                <w:szCs w:val="14"/>
-              </w:rPr>
-              <w:t xml:space="preserve">Nachtrag 2026-0802</w:t>
-            </w:r>
-          </w:p>
-          <w:p>
-            <w:r>
-              <w:rPr>
-                <w:rFonts w:ascii="Calibri" w:cs="Calibri" w:eastAsia="Calibri" w:hAnsi="Calibri"/>
-                <w:b/>
-                <w:bCs/>
-                <w:color w:val="0B2545"/>
-                <w:sz w:val="26"/>
-                <w:szCs w:val="26"/>
-              </w:rPr>
-              <w:t xml:space="preserve">CHF 800.00</w:t>
-            </w:r>
-          </w:p>
-        </w:tc>
-        <w:tc>
-          <w:tcPr>
-            <w:tcW w:type="dxa" w:w="3120"/>
-            <w:tcBorders>
-              <w:top w:val="single" w:color="0B2545" w:sz="12"/>
-              <w:left w:val="single" w:color="0B2545" w:sz="12"/>
-              <w:bottom w:val="single" w:color="0B2545" w:sz="12"/>
-              <w:right w:val="single" w:color="0B2545" w:sz="12"/>
-            </w:tcBorders>
-            <w:shd w:fill="0B2545" w:color="auto" w:val="clear"/>
-            <w:tcMar>
-              <w:top w:type="dxa" w:w="200"/>
-              <w:left w:type="dxa" w:w="220"/>
-              <w:bottom w:type="dxa" w:w="200"/>
-              <w:right w:type="dxa" w:w="220"/>
-            </w:tcMar>
-          </w:tcPr>
-          <w:p>
-            <w:pPr>
-              <w:spacing w:after="40"/>
-            </w:pPr>
-            <w:r>
-              <w:rPr>
-                <w:rFonts w:ascii="Calibri" w:cs="Calibri" w:eastAsia="Calibri" w:hAnsi="Calibri"/>
-                <w:b/>
-                <w:bCs/>
-                <w:caps/>
-                <w:color w:val="B5D5E0"/>
-                <w:spacing w:val="60"/>
-                <w:sz w:val="14"/>
-                <w:szCs w:val="14"/>
-              </w:rPr>
-              <w:t xml:space="preserve">Gesamtsumme Projekt</w:t>
-            </w:r>
-          </w:p>
-          <w:p>
-            <w:r>
-              <w:rPr>
-                <w:rFonts w:ascii="Calibri" w:cs="Calibri" w:eastAsia="Calibri" w:hAnsi="Calibri"/>
-                <w:b/>
-                <w:bCs/>
-                <w:color w:val="FFFFFF"/>
-                <w:sz w:val="26"/>
-                <w:szCs w:val="26"/>
-              </w:rPr>
-              <w:t xml:space="preserve">CHF 2'650.00</w:t>
             </w:r>
           </w:p>
         </w:tc>
@@ -7269,430 +7076,7 @@
           <w:sz w:val="24"/>
           <w:szCs w:val="24"/>
         </w:rPr>
-        <w:t xml:space="preserve">8  Einordnung</w:t>
-      </w:r>
-    </w:p>
-    <w:tbl>
-      <w:tblPr>
-        <w:tblW w:type="dxa" w:w="9360"/>
-        <w:tblBorders>
-          <w:top w:val="single" w:color="0B2545" w:sz="4"/>
-          <w:left w:val="none" w:color="FFFFFF" w:sz="0"/>
-          <w:bottom w:val="single" w:color="0B2545" w:sz="4"/>
-          <w:right w:val="none" w:color="FFFFFF" w:sz="0"/>
-          <w:insideH w:val="single" w:color="E2E8F0" w:sz="2"/>
-          <w:insideV w:val="none" w:color="FFFFFF" w:sz="0"/>
-        </w:tblBorders>
-      </w:tblPr>
-      <w:tblGrid>
-        <w:gridCol w:w="4400"/>
-        <w:gridCol w:w="2800"/>
-        <w:gridCol w:w="2160"/>
-      </w:tblGrid>
-      <w:tr>
-        <w:trPr>
-          <w:tblHeader/>
-        </w:trPr>
-        <w:tc>
-          <w:tcPr>
-            <w:tcW w:type="dxa" w:w="4400"/>
-            <w:shd w:fill="0B2545" w:color="auto" w:val="clear"/>
-            <w:tcMar>
-              <w:top w:type="dxa" w:w="120"/>
-              <w:left w:type="dxa" w:w="140"/>
-              <w:bottom w:type="dxa" w:w="120"/>
-              <w:right w:type="dxa" w:w="140"/>
-            </w:tcMar>
-            <w:vAlign w:val="center"/>
-          </w:tcPr>
-          <w:p>
-            <w:pPr>
-              <w:jc w:val="left"/>
-            </w:pPr>
-            <w:r>
-              <w:rPr>
-                <w:rFonts w:ascii="Calibri" w:cs="Calibri" w:eastAsia="Calibri" w:hAnsi="Calibri"/>
-                <w:b/>
-                <w:bCs/>
-                <w:color w:val="FFFFFF"/>
-                <w:spacing w:val="40"/>
-                <w:sz w:val="18"/>
-                <w:szCs w:val="18"/>
-              </w:rPr>
-              <w:t xml:space="preserve">GRÖSSE</w:t>
-            </w:r>
-          </w:p>
-        </w:tc>
-        <w:tc>
-          <w:tcPr>
-            <w:tcW w:type="dxa" w:w="2800"/>
-            <w:shd w:fill="0B2545" w:color="auto" w:val="clear"/>
-            <w:tcMar>
-              <w:top w:type="dxa" w:w="120"/>
-              <w:left w:type="dxa" w:w="140"/>
-              <w:bottom w:type="dxa" w:w="120"/>
-              <w:right w:type="dxa" w:w="140"/>
-            </w:tcMar>
-            <w:vAlign w:val="center"/>
-          </w:tcPr>
-          <w:p>
-            <w:pPr>
-              <w:jc w:val="right"/>
-            </w:pPr>
-            <w:r>
-              <w:rPr>
-                <w:rFonts w:ascii="Calibri" w:cs="Calibri" w:eastAsia="Calibri" w:hAnsi="Calibri"/>
-                <w:b/>
-                <w:bCs/>
-                <w:color w:val="FFFFFF"/>
-                <w:spacing w:val="40"/>
-                <w:sz w:val="18"/>
-                <w:szCs w:val="18"/>
-              </w:rPr>
-              <w:t xml:space="preserve">BETRAG</w:t>
-            </w:r>
-          </w:p>
-        </w:tc>
-        <w:tc>
-          <w:tcPr>
-            <w:tcW w:type="dxa" w:w="2160"/>
-            <w:shd w:fill="0B2545" w:color="auto" w:val="clear"/>
-            <w:tcMar>
-              <w:top w:type="dxa" w:w="120"/>
-              <w:left w:type="dxa" w:w="140"/>
-              <w:bottom w:type="dxa" w:w="120"/>
-              <w:right w:type="dxa" w:w="140"/>
-            </w:tcMar>
-            <w:vAlign w:val="center"/>
-          </w:tcPr>
-          <w:p>
-            <w:pPr>
-              <w:jc w:val="right"/>
-            </w:pPr>
-            <w:r>
-              <w:rPr>
-                <w:rFonts w:ascii="Calibri" w:cs="Calibri" w:eastAsia="Calibri" w:hAnsi="Calibri"/>
-                <w:b/>
-                <w:bCs/>
-                <w:color w:val="FFFFFF"/>
-                <w:spacing w:val="40"/>
-                <w:sz w:val="18"/>
-                <w:szCs w:val="18"/>
-              </w:rPr>
-              <w:t xml:space="preserve">ANTEIL</w:t>
-            </w:r>
-          </w:p>
-        </w:tc>
-      </w:tr>
-      <w:tr>
-        <w:tc>
-          <w:tcPr>
-            <w:tcW w:type="dxa" w:w="4400"/>
-            <w:tcMar>
-              <w:top w:type="dxa" w:w="90"/>
-              <w:left w:type="dxa" w:w="140"/>
-              <w:bottom w:type="dxa" w:w="90"/>
-              <w:right w:type="dxa" w:w="140"/>
-            </w:tcMar>
-            <w:vAlign w:val="center"/>
-          </w:tcPr>
-          <w:p>
-            <w:pPr>
-              <w:jc w:val="left"/>
-            </w:pPr>
-            <w:r>
-              <w:rPr>
-                <w:rFonts w:ascii="Calibri" w:cs="Calibri" w:eastAsia="Calibri" w:hAnsi="Calibri"/>
-                <w:b w:val="false"/>
-                <w:bCs w:val="false"/>
-                <w:i w:val="false"/>
-                <w:iCs w:val="false"/>
-                <w:color w:val="0F172A"/>
-                <w:sz w:val="20"/>
-                <w:szCs w:val="20"/>
-              </w:rPr>
-              <w:t xml:space="preserve">Rechnung 2026-0801</w:t>
-            </w:r>
-          </w:p>
-        </w:tc>
-        <w:tc>
-          <w:tcPr>
-            <w:tcW w:type="dxa" w:w="2800"/>
-            <w:tcMar>
-              <w:top w:type="dxa" w:w="90"/>
-              <w:left w:type="dxa" w:w="140"/>
-              <w:bottom w:type="dxa" w:w="90"/>
-              <w:right w:type="dxa" w:w="140"/>
-            </w:tcMar>
-            <w:vAlign w:val="center"/>
-          </w:tcPr>
-          <w:p>
-            <w:pPr>
-              <w:jc w:val="right"/>
-            </w:pPr>
-            <w:r>
-              <w:rPr>
-                <w:rFonts w:ascii="Calibri" w:cs="Calibri" w:eastAsia="Calibri" w:hAnsi="Calibri"/>
-                <w:b w:val="false"/>
-                <w:bCs w:val="false"/>
-                <w:i w:val="false"/>
-                <w:iCs w:val="false"/>
-                <w:color w:val="0F172A"/>
-                <w:sz w:val="20"/>
-                <w:szCs w:val="20"/>
-              </w:rPr>
-              <w:t xml:space="preserve">CHF 1'850.00</w:t>
-            </w:r>
-          </w:p>
-        </w:tc>
-        <w:tc>
-          <w:tcPr>
-            <w:tcW w:type="dxa" w:w="2160"/>
-            <w:tcMar>
-              <w:top w:type="dxa" w:w="90"/>
-              <w:left w:type="dxa" w:w="140"/>
-              <w:bottom w:type="dxa" w:w="90"/>
-              <w:right w:type="dxa" w:w="140"/>
-            </w:tcMar>
-            <w:vAlign w:val="center"/>
-          </w:tcPr>
-          <w:p>
-            <w:pPr>
-              <w:jc w:val="right"/>
-            </w:pPr>
-            <w:r>
-              <w:rPr>
-                <w:rFonts w:ascii="Calibri" w:cs="Calibri" w:eastAsia="Calibri" w:hAnsi="Calibri"/>
-                <w:b w:val="false"/>
-                <w:bCs w:val="false"/>
-                <w:i w:val="false"/>
-                <w:iCs w:val="false"/>
-                <w:color w:val="334155"/>
-                <w:sz w:val="20"/>
-                <w:szCs w:val="20"/>
-              </w:rPr>
-              <w:t xml:space="preserve">100 %</w:t>
-            </w:r>
-          </w:p>
-        </w:tc>
-      </w:tr>
-      <w:tr>
-        <w:tc>
-          <w:tcPr>
-            <w:tcW w:type="dxa" w:w="4400"/>
-            <w:shd w:fill="F8FAFC" w:color="auto" w:val="clear"/>
-            <w:tcMar>
-              <w:top w:type="dxa" w:w="90"/>
-              <w:left w:type="dxa" w:w="140"/>
-              <w:bottom w:type="dxa" w:w="90"/>
-              <w:right w:type="dxa" w:w="140"/>
-            </w:tcMar>
-            <w:vAlign w:val="center"/>
-          </w:tcPr>
-          <w:p>
-            <w:pPr>
-              <w:jc w:val="left"/>
-            </w:pPr>
-            <w:r>
-              <w:rPr>
-                <w:rFonts w:ascii="Calibri" w:cs="Calibri" w:eastAsia="Calibri" w:hAnsi="Calibri"/>
-                <w:b w:val="false"/>
-                <w:bCs w:val="false"/>
-                <w:i w:val="false"/>
-                <w:iCs w:val="false"/>
-                <w:color w:val="0F172A"/>
-                <w:sz w:val="20"/>
-                <w:szCs w:val="20"/>
-              </w:rPr>
-              <w:t xml:space="preserve">Nachtrag 2026-0802</w:t>
-            </w:r>
-          </w:p>
-        </w:tc>
-        <w:tc>
-          <w:tcPr>
-            <w:tcW w:type="dxa" w:w="2800"/>
-            <w:shd w:fill="F8FAFC" w:color="auto" w:val="clear"/>
-            <w:tcMar>
-              <w:top w:type="dxa" w:w="90"/>
-              <w:left w:type="dxa" w:w="140"/>
-              <w:bottom w:type="dxa" w:w="90"/>
-              <w:right w:type="dxa" w:w="140"/>
-            </w:tcMar>
-            <w:vAlign w:val="center"/>
-          </w:tcPr>
-          <w:p>
-            <w:pPr>
-              <w:jc w:val="right"/>
-            </w:pPr>
-            <w:r>
-              <w:rPr>
-                <w:rFonts w:ascii="Calibri" w:cs="Calibri" w:eastAsia="Calibri" w:hAnsi="Calibri"/>
-                <w:b w:val="false"/>
-                <w:bCs w:val="false"/>
-                <w:i w:val="false"/>
-                <w:iCs w:val="false"/>
-                <w:color w:val="0F172A"/>
-                <w:sz w:val="20"/>
-                <w:szCs w:val="20"/>
-              </w:rPr>
-              <w:t xml:space="preserve">CHF 800.00</w:t>
-            </w:r>
-          </w:p>
-        </w:tc>
-        <w:tc>
-          <w:tcPr>
-            <w:tcW w:type="dxa" w:w="2160"/>
-            <w:shd w:fill="F8FAFC" w:color="auto" w:val="clear"/>
-            <w:tcMar>
-              <w:top w:type="dxa" w:w="90"/>
-              <w:left w:type="dxa" w:w="140"/>
-              <w:bottom w:type="dxa" w:w="90"/>
-              <w:right w:type="dxa" w:w="140"/>
-            </w:tcMar>
-            <w:vAlign w:val="center"/>
-          </w:tcPr>
-          <w:p>
-            <w:pPr>
-              <w:jc w:val="right"/>
-            </w:pPr>
-            <w:r>
-              <w:rPr>
-                <w:rFonts w:ascii="Calibri" w:cs="Calibri" w:eastAsia="Calibri" w:hAnsi="Calibri"/>
-                <w:b w:val="false"/>
-                <w:bCs w:val="false"/>
-                <w:i w:val="false"/>
-                <w:iCs w:val="false"/>
-                <w:color w:val="334155"/>
-                <w:sz w:val="20"/>
-                <w:szCs w:val="20"/>
-              </w:rPr>
-              <w:t xml:space="preserve">43.2 %</w:t>
-            </w:r>
-          </w:p>
-        </w:tc>
-      </w:tr>
-      <w:tr>
-        <w:tc>
-          <w:tcPr>
-            <w:tcW w:type="dxa" w:w="4400"/>
-            <w:tcMar>
-              <w:top w:type="dxa" w:w="90"/>
-              <w:left w:type="dxa" w:w="140"/>
-              <w:bottom w:type="dxa" w:w="90"/>
-              <w:right w:type="dxa" w:w="140"/>
-            </w:tcMar>
-            <w:vAlign w:val="center"/>
-          </w:tcPr>
-          <w:p>
-            <w:pPr>
-              <w:jc w:val="left"/>
-            </w:pPr>
-            <w:r>
-              <w:rPr>
-                <w:rFonts w:ascii="Calibri" w:cs="Calibri" w:eastAsia="Calibri" w:hAnsi="Calibri"/>
-                <w:b/>
-                <w:bCs/>
-                <w:i w:val="false"/>
-                <w:iCs w:val="false"/>
-                <w:color w:val="0B2545"/>
-                <w:sz w:val="20"/>
-                <w:szCs w:val="20"/>
-              </w:rPr>
-              <w:t xml:space="preserve">Gesamtsumme Projekt</w:t>
-            </w:r>
-          </w:p>
-        </w:tc>
-        <w:tc>
-          <w:tcPr>
-            <w:tcW w:type="dxa" w:w="2800"/>
-            <w:tcMar>
-              <w:top w:type="dxa" w:w="90"/>
-              <w:left w:type="dxa" w:w="140"/>
-              <w:bottom w:type="dxa" w:w="90"/>
-              <w:right w:type="dxa" w:w="140"/>
-            </w:tcMar>
-            <w:vAlign w:val="center"/>
-          </w:tcPr>
-          <w:p>
-            <w:pPr>
-              <w:jc w:val="right"/>
-            </w:pPr>
-            <w:r>
-              <w:rPr>
-                <w:rFonts w:ascii="Calibri" w:cs="Calibri" w:eastAsia="Calibri" w:hAnsi="Calibri"/>
-                <w:b/>
-                <w:bCs/>
-                <w:i w:val="false"/>
-                <w:iCs w:val="false"/>
-                <w:color w:val="0B2545"/>
-                <w:sz w:val="20"/>
-                <w:szCs w:val="20"/>
-              </w:rPr>
-              <w:t xml:space="preserve">CHF 2'650.00</w:t>
-            </w:r>
-          </w:p>
-        </w:tc>
-        <w:tc>
-          <w:tcPr>
-            <w:tcW w:type="dxa" w:w="2160"/>
-            <w:tcMar>
-              <w:top w:type="dxa" w:w="90"/>
-              <w:left w:type="dxa" w:w="140"/>
-              <w:bottom w:type="dxa" w:w="90"/>
-              <w:right w:type="dxa" w:w="140"/>
-            </w:tcMar>
-            <w:vAlign w:val="center"/>
-          </w:tcPr>
-          <w:p>
-            <w:pPr>
-              <w:jc w:val="right"/>
-            </w:pPr>
-            <w:r>
-              <w:rPr>
-                <w:rFonts w:ascii="Calibri" w:cs="Calibri" w:eastAsia="Calibri" w:hAnsi="Calibri"/>
-                <w:b/>
-                <w:bCs/>
-                <w:i w:val="false"/>
-                <w:iCs w:val="false"/>
-                <w:color w:val="0B2545"/>
-                <w:sz w:val="20"/>
-                <w:szCs w:val="20"/>
-              </w:rPr>
-              <w:t xml:space="preserve">143.2 %</w:t>
-            </w:r>
-          </w:p>
-        </w:tc>
-      </w:tr>
-    </w:tbl>
-    <w:p>
-      <w:pPr>
-        <w:spacing w:after="0" w:before="120" w:line="300" w:lineRule="auto"/>
-      </w:pPr>
-      <w:r>
-        <w:rPr>
-          <w:rFonts w:ascii="Calibri" w:cs="Calibri" w:eastAsia="Calibri" w:hAnsi="Calibri"/>
-          <w:color w:val="334155"/>
-          <w:sz w:val="20"/>
-          <w:szCs w:val="20"/>
-        </w:rPr>
-        <w:t xml:space="preserve">Die Messdauer stieg um 71 %, die Rechnungssumme um 43.2 %. Der Nachtrag liegt damit deutlich unter einer proportionalen Fortschreibung. Der Grund: sechs von acht Positionen der Grundrechnung sind von der Verlängerung nicht betroffen und bleiben unverändert.</w:t>
-      </w:r>
-    </w:p>
-    <w:p>
-      <w:pPr>
-        <w:pStyle w:val="Heading2"/>
-        <w:spacing w:after="100" w:before="260"/>
-      </w:pPr>
-      <w:r>
-        <w:rPr>
-          <w:rFonts w:ascii="Calibri" w:cs="Calibri" w:eastAsia="Calibri" w:hAnsi="Calibri"/>
-          <w:b/>
-          <w:bCs/>
-          <w:color w:val="0B2545"/>
-          <w:sz w:val="24"/>
-          <w:szCs w:val="24"/>
-        </w:rPr>
-        <w:t xml:space="preserve">9  Was zusätzlich geleistet und nicht verrechnet wurde</w:t>
+        <w:t xml:space="preserve">8  Was zusätzlich geleistet und nicht verrechnet wurde</w:t>
       </w:r>
     </w:p>
     <w:p>
@@ -8315,7 +7699,6 @@
   <w:p>
     <w:pPr>
       <w:tabs>
-        <w:tab w:val="center" w:pos="4536"/>
         <w:tab w:val="right" w:pos="9072"/>
       </w:tabs>
       <w:jc w:val="left"/>
@@ -8326,8 +7709,8 @@
         <w:b/>
         <w:bCs/>
         <w:color w:val="0B2545"/>
-        <w:sz w:val="16"/>
-        <w:szCs w:val="16"/>
+        <w:sz w:val="15"/>
+        <w:szCs w:val="15"/>
       </w:rPr>
       <w:t xml:space="preserve">kabuu  ·  Netzqualität &amp; EMV Messungen · Engineering</w:t>
     </w:r>
@@ -8335,17 +7718,8 @@
       <w:rPr>
         <w:rFonts w:ascii="Calibri" w:cs="Calibri" w:eastAsia="Calibri" w:hAnsi="Calibri"/>
         <w:color w:val="64748B"/>
-        <w:sz w:val="16"/>
-        <w:szCs w:val="16"/>
-      </w:rPr>
-      <w:t xml:space="preserve">	Im Abt 9 A · 8240 Thayngen · +41 79 512 98 07 · engineering.kabuu@gmail.com</w:t>
-    </w:r>
-    <w:r>
-      <w:rPr>
-        <w:rFonts w:ascii="Calibri" w:cs="Calibri" w:eastAsia="Calibri" w:hAnsi="Calibri"/>
-        <w:color w:val="64748B"/>
-        <w:sz w:val="16"/>
-        <w:szCs w:val="16"/>
+        <w:sz w:val="15"/>
+        <w:szCs w:val="15"/>
       </w:rPr>
       <w:t xml:space="preserve">	Seite </w:t>
     </w:r>
@@ -8355,8 +7729,8 @@
         <w:b/>
         <w:bCs/>
         <w:color w:val="0B2545"/>
-        <w:sz w:val="16"/>
-        <w:szCs w:val="16"/>
+        <w:sz w:val="15"/>
+        <w:szCs w:val="15"/>
       </w:rPr>
       <w:fldChar w:fldCharType="begin"/>
       <w:instrText xml:space="preserve">PAGE</w:instrText>
@@ -8367,8 +7741,8 @@
       <w:rPr>
         <w:rFonts w:ascii="Calibri" w:cs="Calibri" w:eastAsia="Calibri" w:hAnsi="Calibri"/>
         <w:color w:val="64748B"/>
-        <w:sz w:val="16"/>
-        <w:szCs w:val="16"/>
+        <w:sz w:val="15"/>
+        <w:szCs w:val="15"/>
       </w:rPr>
       <w:t xml:space="preserve"> / </w:t>
     </w:r>
@@ -8378,13 +7752,28 @@
         <w:b/>
         <w:bCs/>
         <w:color w:val="0B2545"/>
-        <w:sz w:val="16"/>
-        <w:szCs w:val="16"/>
+        <w:sz w:val="15"/>
+        <w:szCs w:val="15"/>
       </w:rPr>
       <w:fldChar w:fldCharType="begin"/>
       <w:instrText xml:space="preserve">NUMPAGES</w:instrText>
       <w:fldChar w:fldCharType="separate"/>
       <w:fldChar w:fldCharType="end"/>
+    </w:r>
+  </w:p>
+  <w:p>
+    <w:pPr>
+      <w:spacing w:before="20"/>
+      <w:jc w:val="left"/>
+    </w:pPr>
+    <w:r>
+      <w:rPr>
+        <w:rFonts w:ascii="Calibri" w:cs="Calibri" w:eastAsia="Calibri" w:hAnsi="Calibri"/>
+        <w:color w:val="64748B"/>
+        <w:sz w:val="15"/>
+        <w:szCs w:val="15"/>
+      </w:rPr>
+      <w:t xml:space="preserve">Im Abt 9 A · 8240 Thayngen  ·  +41 79 512 98 07  ·  engineering.kabuu@gmail.com</w:t>
     </w:r>
   </w:p>
 </w:ftr>

</xml_diff>